<commit_message>
PRD.docx: switch to BT corporate style (BT_BLUE instead of indigo)
- Palette: BT_BLUE #003D6B, BT_DARK #333333, BT_GRAY #666666, alt row #F2F2F2
- Font: Calibri throughout, 10pt body, 1.15 line spacing
- Title 16pt BT_BLUE centered, subtitle 12pt BT_BLUE centered
- Heading1 12pt BT_BLUE bold with bottom border in BT_BLUE
- Tables: BT_BLUE header with white text, alternating F2F2F2 rows, 999999 borders
- Margins: 2.54cm all sides (BT contract standard)
- Footer remains centered, gray, with PAGE field

Style values inlined (not imported) so the generator stays self-
contained in the OSS repo. Canonical source remains
~/Claude/contract_styles.py.

Co-Authored-By: Claude Opus 4.7 (1M context) <noreply@anthropic.com>
</commit_message>
<xml_diff>
--- a/docs/PRD.docx
+++ b/docs/PRD.docx
@@ -4,122 +4,150 @@
   <w:body>
     <w:p>
       <w:pPr>
-        <w:spacing w:before="0" w:after="40"/>
+        <w:spacing w:after="80"/>
+        <w:jc w:val="center"/>
       </w:pPr>
       <w:r>
         <w:rPr>
+          <w:rFonts w:ascii="Calibri" w:hAnsi="Calibri"/>
           <w:b/>
-          <w:color w:val="0A2540"/>
-          <w:sz w:val="44"/>
+          <w:color w:val="003D6B"/>
+          <w:sz w:val="32"/>
         </w:rPr>
-        <w:t>PRD — School Climate Hub v0.1</w:t>
+        <w:t>School Climate Hub</w:t>
       </w:r>
     </w:p>
     <w:p>
       <w:pPr>
-        <w:spacing w:after="200"/>
+        <w:spacing w:after="240"/>
+        <w:jc w:val="center"/>
       </w:pPr>
       <w:r>
         <w:rPr>
-          <w:color w:val="697386"/>
-          <w:sz w:val="22"/>
+          <w:rFonts w:ascii="Calibri" w:hAnsi="Calibri"/>
+          <w:b/>
+          <w:color w:val="003D6B"/>
+          <w:sz w:val="24"/>
         </w:rPr>
-        <w:t>Product Requirements Document</w:t>
+        <w:t>Product Requirements Document — v0.1</w:t>
       </w:r>
     </w:p>
     <w:p>
+      <w:pPr>
+        <w:spacing w:after="280"/>
+        <w:jc w:val="center"/>
+      </w:pPr>
       <w:r>
         <w:rPr>
-          <w:color w:val="697386"/>
+          <w:rFonts w:ascii="Calibri" w:hAnsi="Calibri"/>
+          <w:color w:val="666666"/>
           <w:sz w:val="18"/>
         </w:rPr>
         <w:t xml:space="preserve">Status: </w:t>
       </w:r>
       <w:r>
         <w:rPr>
+          <w:rFonts w:ascii="Calibri" w:hAnsi="Calibri"/>
           <w:b/>
-          <w:color w:val="0A2540"/>
+          <w:color w:val="333333"/>
           <w:sz w:val="18"/>
         </w:rPr>
         <w:t>Draft for 2026-05-17 UNICEF Venture Fund submission</w:t>
       </w:r>
       <w:r>
         <w:rPr>
-          <w:color w:val="697386"/>
+          <w:rFonts w:ascii="Calibri" w:hAnsi="Calibri"/>
+          <w:color w:val="666666"/>
           <w:sz w:val="18"/>
         </w:rPr>
         <w:t xml:space="preserve">   ·   </w:t>
       </w:r>
       <w:r>
         <w:rPr>
-          <w:color w:val="697386"/>
+          <w:rFonts w:ascii="Calibri" w:hAnsi="Calibri"/>
+          <w:color w:val="666666"/>
           <w:sz w:val="18"/>
         </w:rPr>
         <w:t xml:space="preserve">Owner: </w:t>
       </w:r>
       <w:r>
         <w:rPr>
+          <w:rFonts w:ascii="Calibri" w:hAnsi="Calibri"/>
           <w:b/>
-          <w:color w:val="0A2540"/>
+          <w:color w:val="333333"/>
           <w:sz w:val="18"/>
         </w:rPr>
         <w:t>Reza Malik (BT) · Erum Rabbani (PDLC)</w:t>
       </w:r>
       <w:r>
         <w:rPr>
-          <w:color w:val="697386"/>
+          <w:rFonts w:ascii="Calibri" w:hAnsi="Calibri"/>
+          <w:color w:val="666666"/>
           <w:sz w:val="18"/>
         </w:rPr>
         <w:t xml:space="preserve">   ·   </w:t>
       </w:r>
       <w:r>
         <w:rPr>
-          <w:color w:val="697386"/>
+          <w:rFonts w:ascii="Calibri" w:hAnsi="Calibri"/>
+          <w:color w:val="666666"/>
           <w:sz w:val="18"/>
         </w:rPr>
         <w:t xml:space="preserve">Last updated: </w:t>
       </w:r>
       <w:r>
         <w:rPr>
+          <w:rFonts w:ascii="Calibri" w:hAnsi="Calibri"/>
           <w:b/>
-          <w:color w:val="0A2540"/>
+          <w:color w:val="333333"/>
           <w:sz w:val="18"/>
         </w:rPr>
         <w:t>2026-05-12</w:t>
       </w:r>
     </w:p>
-    <w:p/>
     <w:p>
       <w:pPr>
-        <w:spacing w:before="280" w:after="80"/>
+        <w:spacing w:before="360" w:after="160"/>
+        <w:pBdr>
+          <w:bottom w:val="single" w:sz="4" w:space="1" w:color="003D6B"/>
+        </w:pBdr>
       </w:pPr>
       <w:r>
         <w:rPr>
+          <w:rFonts w:ascii="Calibri" w:hAnsi="Calibri"/>
           <w:b/>
-          <w:color w:val="635BFF"/>
-          <w:sz w:val="26"/>
+          <w:color w:val="003D6B"/>
+          <w:sz w:val="24"/>
         </w:rPr>
         <w:t>1. Problem</w:t>
       </w:r>
     </w:p>
     <w:p>
+      <w:pPr>
+        <w:spacing w:after="120"/>
+      </w:pPr>
       <w:r>
         <w:rPr>
-          <w:color w:val="0A2540"/>
-          <w:sz w:val="21"/>
+          <w:rFonts w:ascii="Calibri" w:hAnsi="Calibri"/>
+          <w:color w:val="333333"/>
+          <w:sz w:val="20"/>
         </w:rPr>
         <w:t>School-level climate exposure data — heat, air quality, flood, rainfall — does not exist as a clean, open, EMIS-keyed dataset. Operators rely on district-level weather and intuition. The data needed to act, school by school, isn't there.</w:t>
       </w:r>
     </w:p>
     <w:p>
       <w:pPr>
-        <w:spacing w:before="280" w:after="80"/>
+        <w:spacing w:before="360" w:after="160"/>
+        <w:pBdr>
+          <w:bottom w:val="single" w:sz="4" w:space="1" w:color="003D6B"/>
+        </w:pBdr>
       </w:pPr>
       <w:r>
         <w:rPr>
+          <w:rFonts w:ascii="Calibri" w:hAnsi="Calibri"/>
           <w:b/>
-          <w:color w:val="635BFF"/>
-          <w:sz w:val="26"/>
+          <w:color w:val="003D6B"/>
+          <w:sz w:val="24"/>
         </w:rPr>
         <w:t>2. Users</w:t>
       </w:r>
@@ -129,22 +157,32 @@
         <w:tblW w:type="auto" w:w="0"/>
         <w:tblLayout w:type="fixed"/>
         <w:tblLook w:firstColumn="1" w:firstRow="1" w:lastColumn="0" w:lastRow="0" w:noHBand="0" w:noVBand="1" w:val="04A0"/>
+        <w:tblBorders>
+          <w:top w:val="single" w:sz="4" w:space="0" w:color="999999"/>
+          <w:left w:val="single" w:sz="4" w:space="0" w:color="999999"/>
+          <w:bottom w:val="single" w:sz="4" w:space="0" w:color="999999"/>
+          <w:right w:val="single" w:sz="4" w:space="0" w:color="999999"/>
+          <w:insideH w:val="single" w:sz="4" w:space="0" w:color="999999"/>
+          <w:insideV w:val="single" w:sz="4" w:space="0" w:color="999999"/>
+        </w:tblBorders>
       </w:tblPr>
       <w:tblGrid>
-        <w:gridCol w:w="4824"/>
-        <w:gridCol w:w="4824"/>
+        <w:gridCol w:w="4680"/>
+        <w:gridCol w:w="4680"/>
       </w:tblGrid>
       <w:tr>
         <w:tc>
           <w:tcPr>
             <w:tcW w:type="dxa" w:w="3600"/>
-            <w:shd w:val="clear" w:color="auto" w:fill="F0F1FF"/>
+            <w:shd w:fill="003D6B" w:val="clear"/>
           </w:tcPr>
           <w:p>
+            <w:r/>
             <w:r>
               <w:rPr>
+                <w:rFonts w:ascii="Calibri" w:hAnsi="Calibri"/>
                 <w:b/>
-                <w:color w:val="635BFF"/>
+                <w:color w:val="FFFFFF"/>
                 <w:sz w:val="18"/>
               </w:rPr>
               <w:t>User</w:t>
@@ -153,14 +191,16 @@
         </w:tc>
         <w:tc>
           <w:tcPr>
-            <w:tcW w:type="dxa" w:w="6336"/>
-            <w:shd w:val="clear" w:color="auto" w:fill="F0F1FF"/>
+            <w:tcW w:type="dxa" w:w="5760"/>
+            <w:shd w:fill="003D6B" w:val="clear"/>
           </w:tcPr>
           <w:p>
+            <w:r/>
             <w:r>
               <w:rPr>
+                <w:rFonts w:ascii="Calibri" w:hAnsi="Calibri"/>
                 <w:b/>
-                <w:color w:val="635BFF"/>
+                <w:color w:val="FFFFFF"/>
                 <w:sz w:val="18"/>
               </w:rPr>
               <w:t>When they use it</w:t>
@@ -174,10 +214,12 @@
             <w:tcW w:type="dxa" w:w="3600"/>
           </w:tcPr>
           <w:p>
+            <w:r/>
             <w:r>
               <w:rPr>
-                <w:color w:val="425466"/>
-                <w:sz w:val="19"/>
+                <w:rFonts w:ascii="Calibri" w:hAnsi="Calibri"/>
+                <w:color w:val="333333"/>
+                <w:sz w:val="18"/>
               </w:rPr>
               <w:t>District operator (Zeeshan @ PDLC)</w:t>
             </w:r>
@@ -185,13 +227,15 @@
         </w:tc>
         <w:tc>
           <w:tcPr>
-            <w:tcW w:type="dxa" w:w="6336"/>
+            <w:tcW w:type="dxa" w:w="5760"/>
           </w:tcPr>
           <w:p>
+            <w:r/>
             <w:r>
               <w:rPr>
-                <w:color w:val="425466"/>
-                <w:sz w:val="19"/>
+                <w:rFonts w:ascii="Calibri" w:hAnsi="Calibri"/>
+                <w:color w:val="333333"/>
+                <w:sz w:val="18"/>
               </w:rPr>
               <w:t>Daily — hazard triage, advisory dispatch</w:t>
             </w:r>
@@ -202,12 +246,15 @@
         <w:tc>
           <w:tcPr>
             <w:tcW w:type="dxa" w:w="3600"/>
+            <w:shd w:fill="F2F2F2" w:val="clear"/>
           </w:tcPr>
           <w:p>
+            <w:r/>
             <w:r>
               <w:rPr>
-                <w:color w:val="425466"/>
-                <w:sz w:val="19"/>
+                <w:rFonts w:ascii="Calibri" w:hAnsi="Calibri"/>
+                <w:color w:val="333333"/>
+                <w:sz w:val="18"/>
               </w:rPr>
               <w:t>District education officer</w:t>
             </w:r>
@@ -215,13 +262,16 @@
         </w:tc>
         <w:tc>
           <w:tcPr>
-            <w:tcW w:type="dxa" w:w="6336"/>
+            <w:tcW w:type="dxa" w:w="5760"/>
+            <w:shd w:fill="F2F2F2" w:val="clear"/>
           </w:tcPr>
           <w:p>
+            <w:r/>
             <w:r>
               <w:rPr>
-                <w:color w:val="425466"/>
-                <w:sz w:val="19"/>
+                <w:rFonts w:ascii="Calibri" w:hAnsi="Calibri"/>
+                <w:color w:val="333333"/>
+                <w:sz w:val="18"/>
               </w:rPr>
               <w:t>Weekly+ — closure decisions, escalations</w:t>
             </w:r>
@@ -234,10 +284,12 @@
             <w:tcW w:type="dxa" w:w="3600"/>
           </w:tcPr>
           <w:p>
+            <w:r/>
             <w:r>
               <w:rPr>
-                <w:color w:val="425466"/>
-                <w:sz w:val="19"/>
+                <w:rFonts w:ascii="Calibri" w:hAnsi="Calibri"/>
+                <w:color w:val="333333"/>
+                <w:sz w:val="18"/>
               </w:rPr>
               <w:t>School principal</w:t>
             </w:r>
@@ -245,13 +297,15 @@
         </w:tc>
         <w:tc>
           <w:tcPr>
-            <w:tcW w:type="dxa" w:w="6336"/>
+            <w:tcW w:type="dxa" w:w="5760"/>
           </w:tcPr>
           <w:p>
+            <w:r/>
             <w:r>
               <w:rPr>
-                <w:color w:val="425466"/>
-                <w:sz w:val="19"/>
+                <w:rFonts w:ascii="Calibri" w:hAnsi="Calibri"/>
+                <w:color w:val="333333"/>
+                <w:sz w:val="18"/>
               </w:rPr>
               <w:t>When alerted — confirms action taken</w:t>
             </w:r>
@@ -262,12 +316,15 @@
         <w:tc>
           <w:tcPr>
             <w:tcW w:type="dxa" w:w="3600"/>
+            <w:shd w:fill="F2F2F2" w:val="clear"/>
           </w:tcPr>
           <w:p>
+            <w:r/>
             <w:r>
               <w:rPr>
-                <w:color w:val="425466"/>
-                <w:sz w:val="19"/>
+                <w:rFonts w:ascii="Calibri" w:hAnsi="Calibri"/>
+                <w:color w:val="333333"/>
+                <w:sz w:val="18"/>
               </w:rPr>
               <w:t>Parent / guardian</w:t>
             </w:r>
@@ -275,13 +332,16 @@
         </w:tc>
         <w:tc>
           <w:tcPr>
-            <w:tcW w:type="dxa" w:w="6336"/>
+            <w:tcW w:type="dxa" w:w="5760"/>
+            <w:shd w:fill="F2F2F2" w:val="clear"/>
           </w:tcPr>
           <w:p>
+            <w:r/>
             <w:r>
               <w:rPr>
-                <w:color w:val="425466"/>
-                <w:sz w:val="19"/>
+                <w:rFonts w:ascii="Calibri" w:hAnsi="Calibri"/>
+                <w:color w:val="333333"/>
+                <w:sz w:val="18"/>
               </w:rPr>
               <w:t>When alerted — acts on advisory</w:t>
             </w:r>
@@ -294,10 +354,12 @@
             <w:tcW w:type="dxa" w:w="3600"/>
           </w:tcPr>
           <w:p>
+            <w:r/>
             <w:r>
               <w:rPr>
-                <w:color w:val="425466"/>
-                <w:sz w:val="19"/>
+                <w:rFonts w:ascii="Calibri" w:hAnsi="Calibri"/>
+                <w:color w:val="333333"/>
+                <w:sz w:val="18"/>
               </w:rPr>
               <w:t>UNICEF reviewer</w:t>
             </w:r>
@@ -305,13 +367,15 @@
         </w:tc>
         <w:tc>
           <w:tcPr>
-            <w:tcW w:type="dxa" w:w="6336"/>
+            <w:tcW w:type="dxa" w:w="5760"/>
           </w:tcPr>
           <w:p>
+            <w:r/>
             <w:r>
               <w:rPr>
-                <w:color w:val="425466"/>
-                <w:sz w:val="19"/>
+                <w:rFonts w:ascii="Calibri" w:hAnsi="Calibri"/>
+                <w:color w:val="333333"/>
+                <w:sz w:val="18"/>
               </w:rPr>
               <w:t>One-time — evaluates the submission</w:t>
             </w:r>
@@ -322,12 +386,15 @@
         <w:tc>
           <w:tcPr>
             <w:tcW w:type="dxa" w:w="3600"/>
+            <w:shd w:fill="F2F2F2" w:val="clear"/>
           </w:tcPr>
           <w:p>
+            <w:r/>
             <w:r>
               <w:rPr>
-                <w:color w:val="425466"/>
-                <w:sz w:val="19"/>
+                <w:rFonts w:ascii="Calibri" w:hAnsi="Calibri"/>
+                <w:color w:val="333333"/>
+                <w:sz w:val="18"/>
               </w:rPr>
               <w:t>Researcher / NGO / ministry</w:t>
             </w:r>
@@ -335,13 +402,16 @@
         </w:tc>
         <w:tc>
           <w:tcPr>
-            <w:tcW w:type="dxa" w:w="6336"/>
+            <w:tcW w:type="dxa" w:w="5760"/>
+            <w:shd w:fill="F2F2F2" w:val="clear"/>
           </w:tcPr>
           <w:p>
+            <w:r/>
             <w:r>
               <w:rPr>
-                <w:color w:val="425466"/>
-                <w:sz w:val="19"/>
+                <w:rFonts w:ascii="Calibri" w:hAnsi="Calibri"/>
+                <w:color w:val="333333"/>
+                <w:sz w:val="18"/>
               </w:rPr>
               <w:t>Ad-hoc — downloads the open dataset</w:t>
             </w:r>
@@ -349,15 +419,20 @@
         </w:tc>
       </w:tr>
     </w:tbl>
+    <w:p/>
     <w:p>
       <w:pPr>
-        <w:spacing w:before="280" w:after="80"/>
+        <w:spacing w:before="360" w:after="160"/>
+        <w:pBdr>
+          <w:bottom w:val="single" w:sz="4" w:space="1" w:color="003D6B"/>
+        </w:pBdr>
       </w:pPr>
       <w:r>
         <w:rPr>
+          <w:rFonts w:ascii="Calibri" w:hAnsi="Calibri"/>
           <w:b/>
-          <w:color w:val="635BFF"/>
-          <w:sz w:val="26"/>
+          <w:color w:val="003D6B"/>
+          <w:sz w:val="24"/>
         </w:rPr>
         <w:t>3. Jobs to be done</w:t>
       </w:r>
@@ -367,23 +442,33 @@
         <w:tblW w:type="auto" w:w="0"/>
         <w:tblLayout w:type="fixed"/>
         <w:tblLook w:firstColumn="1" w:firstRow="1" w:lastColumn="0" w:lastRow="0" w:noHBand="0" w:noVBand="1" w:val="04A0"/>
+        <w:tblBorders>
+          <w:top w:val="single" w:sz="4" w:space="0" w:color="999999"/>
+          <w:left w:val="single" w:sz="4" w:space="0" w:color="999999"/>
+          <w:bottom w:val="single" w:sz="4" w:space="0" w:color="999999"/>
+          <w:right w:val="single" w:sz="4" w:space="0" w:color="999999"/>
+          <w:insideH w:val="single" w:sz="4" w:space="0" w:color="999999"/>
+          <w:insideV w:val="single" w:sz="4" w:space="0" w:color="999999"/>
+        </w:tblBorders>
       </w:tblPr>
       <w:tblGrid>
-        <w:gridCol w:w="3216"/>
-        <w:gridCol w:w="3216"/>
-        <w:gridCol w:w="3216"/>
+        <w:gridCol w:w="3120"/>
+        <w:gridCol w:w="3120"/>
+        <w:gridCol w:w="3120"/>
       </w:tblGrid>
       <w:tr>
         <w:tc>
           <w:tcPr>
             <w:tcW w:type="dxa" w:w="720"/>
-            <w:shd w:val="clear" w:color="auto" w:fill="F0F1FF"/>
+            <w:shd w:fill="003D6B" w:val="clear"/>
           </w:tcPr>
           <w:p>
+            <w:r/>
             <w:r>
               <w:rPr>
+                <w:rFonts w:ascii="Calibri" w:hAnsi="Calibri"/>
                 <w:b/>
-                <w:color w:val="635BFF"/>
+                <w:color w:val="FFFFFF"/>
                 <w:sz w:val="18"/>
               </w:rPr>
               <w:t>ID</w:t>
@@ -392,14 +477,16 @@
         </w:tc>
         <w:tc>
           <w:tcPr>
-            <w:tcW w:type="dxa" w:w="6048"/>
-            <w:shd w:val="clear" w:color="auto" w:fill="F0F1FF"/>
+            <w:tcW w:type="dxa" w:w="5760"/>
+            <w:shd w:fill="003D6B" w:val="clear"/>
           </w:tcPr>
           <w:p>
+            <w:r/>
             <w:r>
               <w:rPr>
+                <w:rFonts w:ascii="Calibri" w:hAnsi="Calibri"/>
                 <w:b/>
-                <w:color w:val="635BFF"/>
+                <w:color w:val="FFFFFF"/>
                 <w:sz w:val="18"/>
               </w:rPr>
               <w:t>Job</w:t>
@@ -408,14 +495,16 @@
         </w:tc>
         <w:tc>
           <w:tcPr>
-            <w:tcW w:type="dxa" w:w="3168"/>
-            <w:shd w:val="clear" w:color="auto" w:fill="F0F1FF"/>
+            <w:tcW w:type="dxa" w:w="2880"/>
+            <w:shd w:fill="003D6B" w:val="clear"/>
           </w:tcPr>
           <w:p>
+            <w:r/>
             <w:r>
               <w:rPr>
+                <w:rFonts w:ascii="Calibri" w:hAnsi="Calibri"/>
                 <w:b/>
-                <w:color w:val="635BFF"/>
+                <w:color w:val="FFFFFF"/>
                 <w:sz w:val="18"/>
               </w:rPr>
               <w:t>Surface</w:t>
@@ -429,10 +518,12 @@
             <w:tcW w:type="dxa" w:w="720"/>
           </w:tcPr>
           <w:p>
+            <w:r/>
             <w:r>
               <w:rPr>
-                <w:color w:val="425466"/>
-                <w:sz w:val="19"/>
+                <w:rFonts w:ascii="Calibri" w:hAnsi="Calibri"/>
+                <w:color w:val="333333"/>
+                <w:sz w:val="18"/>
               </w:rPr>
               <w:t>J1</w:t>
             </w:r>
@@ -440,13 +531,15 @@
         </w:tc>
         <w:tc>
           <w:tcPr>
-            <w:tcW w:type="dxa" w:w="6048"/>
+            <w:tcW w:type="dxa" w:w="5760"/>
           </w:tcPr>
           <w:p>
+            <w:r/>
             <w:r>
               <w:rPr>
-                <w:color w:val="425466"/>
-                <w:sz w:val="19"/>
+                <w:rFonts w:ascii="Calibri" w:hAnsi="Calibri"/>
+                <w:color w:val="333333"/>
+                <w:sz w:val="18"/>
               </w:rPr>
               <w:t>What's happening across my estate right now?</w:t>
             </w:r>
@@ -454,13 +547,15 @@
         </w:tc>
         <w:tc>
           <w:tcPr>
-            <w:tcW w:type="dxa" w:w="3168"/>
+            <w:tcW w:type="dxa" w:w="2880"/>
           </w:tcPr>
           <w:p>
+            <w:r/>
             <w:r>
               <w:rPr>
-                <w:color w:val="425466"/>
-                <w:sz w:val="19"/>
+                <w:rFonts w:ascii="Calibri" w:hAnsi="Calibri"/>
+                <w:color w:val="333333"/>
+                <w:sz w:val="18"/>
               </w:rPr>
               <w:t>Overview (map + KPIs)</w:t>
             </w:r>
@@ -471,12 +566,15 @@
         <w:tc>
           <w:tcPr>
             <w:tcW w:type="dxa" w:w="720"/>
+            <w:shd w:fill="F2F2F2" w:val="clear"/>
           </w:tcPr>
           <w:p>
+            <w:r/>
             <w:r>
               <w:rPr>
-                <w:color w:val="425466"/>
-                <w:sz w:val="19"/>
+                <w:rFonts w:ascii="Calibri" w:hAnsi="Calibri"/>
+                <w:color w:val="333333"/>
+                <w:sz w:val="18"/>
               </w:rPr>
               <w:t>J2</w:t>
             </w:r>
@@ -484,13 +582,16 @@
         </w:tc>
         <w:tc>
           <w:tcPr>
-            <w:tcW w:type="dxa" w:w="6048"/>
+            <w:tcW w:type="dxa" w:w="5760"/>
+            <w:shd w:fill="F2F2F2" w:val="clear"/>
           </w:tcPr>
           <w:p>
+            <w:r/>
             <w:r>
               <w:rPr>
-                <w:color w:val="425466"/>
-                <w:sz w:val="19"/>
+                <w:rFonts w:ascii="Calibri" w:hAnsi="Calibri"/>
+                <w:color w:val="333333"/>
+                <w:sz w:val="18"/>
               </w:rPr>
               <w:t>Which schools need a decision today?</w:t>
             </w:r>
@@ -498,13 +599,16 @@
         </w:tc>
         <w:tc>
           <w:tcPr>
-            <w:tcW w:type="dxa" w:w="3168"/>
+            <w:tcW w:type="dxa" w:w="2880"/>
+            <w:shd w:fill="F2F2F2" w:val="clear"/>
           </w:tcPr>
           <w:p>
+            <w:r/>
             <w:r>
               <w:rPr>
-                <w:color w:val="425466"/>
-                <w:sz w:val="19"/>
+                <w:rFonts w:ascii="Calibri" w:hAnsi="Calibri"/>
+                <w:color w:val="333333"/>
+                <w:sz w:val="18"/>
               </w:rPr>
               <w:t>Overview (active alerts)</w:t>
             </w:r>
@@ -517,10 +621,12 @@
             <w:tcW w:type="dxa" w:w="720"/>
           </w:tcPr>
           <w:p>
+            <w:r/>
             <w:r>
               <w:rPr>
-                <w:color w:val="425466"/>
-                <w:sz w:val="19"/>
+                <w:rFonts w:ascii="Calibri" w:hAnsi="Calibri"/>
+                <w:color w:val="333333"/>
+                <w:sz w:val="18"/>
               </w:rPr>
               <w:t>J3</w:t>
             </w:r>
@@ -528,13 +634,15 @@
         </w:tc>
         <w:tc>
           <w:tcPr>
-            <w:tcW w:type="dxa" w:w="6048"/>
+            <w:tcW w:type="dxa" w:w="5760"/>
           </w:tcPr>
           <w:p>
+            <w:r/>
             <w:r>
               <w:rPr>
-                <w:color w:val="425466"/>
-                <w:sz w:val="19"/>
+                <w:rFonts w:ascii="Calibri" w:hAnsi="Calibri"/>
+                <w:color w:val="333333"/>
+                <w:sz w:val="18"/>
               </w:rPr>
               <w:t>Send a parent advisory in 3 languages</w:t>
             </w:r>
@@ -542,13 +650,15 @@
         </w:tc>
         <w:tc>
           <w:tcPr>
-            <w:tcW w:type="dxa" w:w="3168"/>
+            <w:tcW w:type="dxa" w:w="2880"/>
           </w:tcPr>
           <w:p>
+            <w:r/>
             <w:r>
               <w:rPr>
-                <w:color w:val="425466"/>
-                <w:sz w:val="19"/>
+                <w:rFonts w:ascii="Calibri" w:hAnsi="Calibri"/>
+                <w:color w:val="333333"/>
+                <w:sz w:val="18"/>
               </w:rPr>
               <w:t>Dispatch flow</w:t>
             </w:r>
@@ -559,12 +669,15 @@
         <w:tc>
           <w:tcPr>
             <w:tcW w:type="dxa" w:w="720"/>
+            <w:shd w:fill="F2F2F2" w:val="clear"/>
           </w:tcPr>
           <w:p>
+            <w:r/>
             <w:r>
               <w:rPr>
-                <w:color w:val="425466"/>
-                <w:sz w:val="19"/>
+                <w:rFonts w:ascii="Calibri" w:hAnsi="Calibri"/>
+                <w:color w:val="333333"/>
+                <w:sz w:val="18"/>
               </w:rPr>
               <w:t>J4</w:t>
             </w:r>
@@ -572,13 +685,16 @@
         </w:tc>
         <w:tc>
           <w:tcPr>
-            <w:tcW w:type="dxa" w:w="6048"/>
+            <w:tcW w:type="dxa" w:w="5760"/>
+            <w:shd w:fill="F2F2F2" w:val="clear"/>
           </w:tcPr>
           <w:p>
+            <w:r/>
             <w:r>
               <w:rPr>
-                <w:color w:val="425466"/>
-                <w:sz w:val="19"/>
+                <w:rFonts w:ascii="Calibri" w:hAnsi="Calibri"/>
+                <w:color w:val="333333"/>
+                <w:sz w:val="18"/>
               </w:rPr>
               <w:t>Modify a school day (early dismissal, water rations)</w:t>
             </w:r>
@@ -586,13 +702,16 @@
         </w:tc>
         <w:tc>
           <w:tcPr>
-            <w:tcW w:type="dxa" w:w="3168"/>
+            <w:tcW w:type="dxa" w:w="2880"/>
+            <w:shd w:fill="F2F2F2" w:val="clear"/>
           </w:tcPr>
           <w:p>
+            <w:r/>
             <w:r>
               <w:rPr>
-                <w:color w:val="425466"/>
-                <w:sz w:val="19"/>
+                <w:rFonts w:ascii="Calibri" w:hAnsi="Calibri"/>
+                <w:color w:val="333333"/>
+                <w:sz w:val="18"/>
               </w:rPr>
               <w:t>School-day modal</w:t>
             </w:r>
@@ -605,10 +724,12 @@
             <w:tcW w:type="dxa" w:w="720"/>
           </w:tcPr>
           <w:p>
+            <w:r/>
             <w:r>
               <w:rPr>
-                <w:color w:val="425466"/>
-                <w:sz w:val="19"/>
+                <w:rFonts w:ascii="Calibri" w:hAnsi="Calibri"/>
+                <w:color w:val="333333"/>
+                <w:sz w:val="18"/>
               </w:rPr>
               <w:t>J5</w:t>
             </w:r>
@@ -616,13 +737,15 @@
         </w:tc>
         <w:tc>
           <w:tcPr>
-            <w:tcW w:type="dxa" w:w="6048"/>
+            <w:tcW w:type="dxa" w:w="5760"/>
           </w:tcPr>
           <w:p>
+            <w:r/>
             <w:r>
               <w:rPr>
-                <w:color w:val="425466"/>
-                <w:sz w:val="19"/>
+                <w:rFonts w:ascii="Calibri" w:hAnsi="Calibri"/>
+                <w:color w:val="333333"/>
+                <w:sz w:val="18"/>
               </w:rPr>
               <w:t>Compare schools, drill down on one</w:t>
             </w:r>
@@ -630,13 +753,15 @@
         </w:tc>
         <w:tc>
           <w:tcPr>
-            <w:tcW w:type="dxa" w:w="3168"/>
+            <w:tcW w:type="dxa" w:w="2880"/>
           </w:tcPr>
           <w:p>
+            <w:r/>
             <w:r>
               <w:rPr>
-                <w:color w:val="425466"/>
-                <w:sz w:val="19"/>
+                <w:rFonts w:ascii="Calibri" w:hAnsi="Calibri"/>
+                <w:color w:val="333333"/>
+                <w:sz w:val="18"/>
               </w:rPr>
               <w:t>Schools matrix → drawer</w:t>
             </w:r>
@@ -647,12 +772,15 @@
         <w:tc>
           <w:tcPr>
             <w:tcW w:type="dxa" w:w="720"/>
+            <w:shd w:fill="F2F2F2" w:val="clear"/>
           </w:tcPr>
           <w:p>
+            <w:r/>
             <w:r>
               <w:rPr>
-                <w:color w:val="425466"/>
-                <w:sz w:val="19"/>
+                <w:rFonts w:ascii="Calibri" w:hAnsi="Calibri"/>
+                <w:color w:val="333333"/>
+                <w:sz w:val="18"/>
               </w:rPr>
               <w:t>J6</w:t>
             </w:r>
@@ -660,13 +788,16 @@
         </w:tc>
         <w:tc>
           <w:tcPr>
-            <w:tcW w:type="dxa" w:w="6048"/>
+            <w:tcW w:type="dxa" w:w="5760"/>
+            <w:shd w:fill="F2F2F2" w:val="clear"/>
           </w:tcPr>
           <w:p>
+            <w:r/>
             <w:r>
               <w:rPr>
-                <w:color w:val="425466"/>
-                <w:sz w:val="19"/>
+                <w:rFonts w:ascii="Calibri" w:hAnsi="Calibri"/>
+                <w:color w:val="333333"/>
+                <w:sz w:val="18"/>
               </w:rPr>
               <w:t>Understand why a school's score is high</w:t>
             </w:r>
@@ -674,13 +805,16 @@
         </w:tc>
         <w:tc>
           <w:tcPr>
-            <w:tcW w:type="dxa" w:w="3168"/>
+            <w:tcW w:type="dxa" w:w="2880"/>
+            <w:shd w:fill="F2F2F2" w:val="clear"/>
           </w:tcPr>
           <w:p>
+            <w:r/>
             <w:r>
               <w:rPr>
-                <w:color w:val="425466"/>
-                <w:sz w:val="19"/>
+                <w:rFonts w:ascii="Calibri" w:hAnsi="Calibri"/>
+                <w:color w:val="333333"/>
+                <w:sz w:val="18"/>
               </w:rPr>
               <w:t>School drawer → Why this score?</w:t>
             </w:r>
@@ -693,10 +827,12 @@
             <w:tcW w:type="dxa" w:w="720"/>
           </w:tcPr>
           <w:p>
+            <w:r/>
             <w:r>
               <w:rPr>
-                <w:color w:val="425466"/>
-                <w:sz w:val="19"/>
+                <w:rFonts w:ascii="Calibri" w:hAnsi="Calibri"/>
+                <w:color w:val="333333"/>
+                <w:sz w:val="18"/>
               </w:rPr>
               <w:t>J7</w:t>
             </w:r>
@@ -704,13 +840,15 @@
         </w:tc>
         <w:tc>
           <w:tcPr>
-            <w:tcW w:type="dxa" w:w="6048"/>
+            <w:tcW w:type="dxa" w:w="5760"/>
           </w:tcPr>
           <w:p>
+            <w:r/>
             <w:r>
               <w:rPr>
-                <w:color w:val="425466"/>
-                <w:sz w:val="19"/>
+                <w:rFonts w:ascii="Calibri" w:hAnsi="Calibri"/>
+                <w:color w:val="333333"/>
+                <w:sz w:val="18"/>
               </w:rPr>
               <w:t>Get the underlying open dataset</w:t>
             </w:r>
@@ -718,13 +856,15 @@
         </w:tc>
         <w:tc>
           <w:tcPr>
-            <w:tcW w:type="dxa" w:w="3168"/>
+            <w:tcW w:type="dxa" w:w="2880"/>
           </w:tcPr>
           <w:p>
+            <w:r/>
             <w:r>
               <w:rPr>
-                <w:color w:val="425466"/>
-                <w:sz w:val="19"/>
+                <w:rFonts w:ascii="Calibri" w:hAnsi="Calibri"/>
+                <w:color w:val="333333"/>
+                <w:sz w:val="18"/>
               </w:rPr>
               <w:t>Open Data view</w:t>
             </w:r>
@@ -735,12 +875,15 @@
         <w:tc>
           <w:tcPr>
             <w:tcW w:type="dxa" w:w="720"/>
+            <w:shd w:fill="F2F2F2" w:val="clear"/>
           </w:tcPr>
           <w:p>
+            <w:r/>
             <w:r>
               <w:rPr>
-                <w:color w:val="425466"/>
-                <w:sz w:val="19"/>
+                <w:rFonts w:ascii="Calibri" w:hAnsi="Calibri"/>
+                <w:color w:val="333333"/>
+                <w:sz w:val="18"/>
               </w:rPr>
               <w:t>J8</w:t>
             </w:r>
@@ -748,13 +891,16 @@
         </w:tc>
         <w:tc>
           <w:tcPr>
-            <w:tcW w:type="dxa" w:w="6048"/>
+            <w:tcW w:type="dxa" w:w="5760"/>
+            <w:shd w:fill="F2F2F2" w:val="clear"/>
           </w:tcPr>
           <w:p>
+            <w:r/>
             <w:r>
               <w:rPr>
-                <w:color w:val="425466"/>
-                <w:sz w:val="19"/>
+                <w:rFonts w:ascii="Calibri" w:hAnsi="Calibri"/>
+                <w:color w:val="333333"/>
+                <w:sz w:val="18"/>
               </w:rPr>
               <w:t>Ask a natural-language question</w:t>
             </w:r>
@@ -762,13 +908,16 @@
         </w:tc>
         <w:tc>
           <w:tcPr>
-            <w:tcW w:type="dxa" w:w="3168"/>
+            <w:tcW w:type="dxa" w:w="2880"/>
+            <w:shd w:fill="F2F2F2" w:val="clear"/>
           </w:tcPr>
           <w:p>
+            <w:r/>
             <w:r>
               <w:rPr>
-                <w:color w:val="425466"/>
-                <w:sz w:val="19"/>
+                <w:rFonts w:ascii="Calibri" w:hAnsi="Calibri"/>
+                <w:color w:val="333333"/>
+                <w:sz w:val="18"/>
               </w:rPr>
               <w:t>Chat (⌘K / FAB)</w:t>
             </w:r>
@@ -781,10 +930,12 @@
             <w:tcW w:type="dxa" w:w="720"/>
           </w:tcPr>
           <w:p>
+            <w:r/>
             <w:r>
               <w:rPr>
-                <w:color w:val="425466"/>
-                <w:sz w:val="19"/>
+                <w:rFonts w:ascii="Calibri" w:hAnsi="Calibri"/>
+                <w:color w:val="333333"/>
+                <w:sz w:val="18"/>
               </w:rPr>
               <w:t>J9</w:t>
             </w:r>
@@ -792,13 +943,15 @@
         </w:tc>
         <w:tc>
           <w:tcPr>
-            <w:tcW w:type="dxa" w:w="6048"/>
+            <w:tcW w:type="dxa" w:w="5760"/>
           </w:tcPr>
           <w:p>
+            <w:r/>
             <w:r>
               <w:rPr>
-                <w:color w:val="425466"/>
-                <w:sz w:val="19"/>
+                <w:rFonts w:ascii="Calibri" w:hAnsi="Calibri"/>
+                <w:color w:val="333333"/>
+                <w:sz w:val="18"/>
               </w:rPr>
               <w:t>Tune thresholds, languages, channels, templates</w:t>
             </w:r>
@@ -806,13 +959,15 @@
         </w:tc>
         <w:tc>
           <w:tcPr>
-            <w:tcW w:type="dxa" w:w="3168"/>
+            <w:tcW w:type="dxa" w:w="2880"/>
           </w:tcPr>
           <w:p>
+            <w:r/>
             <w:r>
               <w:rPr>
-                <w:color w:val="425466"/>
-                <w:sz w:val="19"/>
+                <w:rFonts w:ascii="Calibri" w:hAnsi="Calibri"/>
+                <w:color w:val="333333"/>
+                <w:sz w:val="18"/>
               </w:rPr>
               <w:t>Settings</w:t>
             </w:r>
@@ -823,12 +978,15 @@
         <w:tc>
           <w:tcPr>
             <w:tcW w:type="dxa" w:w="720"/>
+            <w:shd w:fill="F2F2F2" w:val="clear"/>
           </w:tcPr>
           <w:p>
+            <w:r/>
             <w:r>
               <w:rPr>
-                <w:color w:val="425466"/>
-                <w:sz w:val="19"/>
+                <w:rFonts w:ascii="Calibri" w:hAnsi="Calibri"/>
+                <w:color w:val="333333"/>
+                <w:sz w:val="18"/>
               </w:rPr>
               <w:t>J10</w:t>
             </w:r>
@@ -836,13 +994,16 @@
         </w:tc>
         <w:tc>
           <w:tcPr>
-            <w:tcW w:type="dxa" w:w="6048"/>
+            <w:tcW w:type="dxa" w:w="5760"/>
+            <w:shd w:fill="F2F2F2" w:val="clear"/>
           </w:tcPr>
           <w:p>
+            <w:r/>
             <w:r>
               <w:rPr>
-                <w:color w:val="425466"/>
-                <w:sz w:val="19"/>
+                <w:rFonts w:ascii="Calibri" w:hAnsi="Calibri"/>
+                <w:color w:val="333333"/>
+                <w:sz w:val="18"/>
               </w:rPr>
               <w:t>Broadcast advisory to an entire cluster</w:t>
             </w:r>
@@ -850,13 +1011,16 @@
         </w:tc>
         <w:tc>
           <w:tcPr>
-            <w:tcW w:type="dxa" w:w="3168"/>
+            <w:tcW w:type="dxa" w:w="2880"/>
+            <w:shd w:fill="F2F2F2" w:val="clear"/>
           </w:tcPr>
           <w:p>
+            <w:r/>
             <w:r>
               <w:rPr>
-                <w:color w:val="425466"/>
-                <w:sz w:val="19"/>
+                <w:rFonts w:ascii="Calibri" w:hAnsi="Calibri"/>
+                <w:color w:val="333333"/>
+                <w:sz w:val="18"/>
               </w:rPr>
               <w:t>Overview → cluster row</w:t>
             </w:r>
@@ -864,15 +1028,20 @@
         </w:tc>
       </w:tr>
     </w:tbl>
+    <w:p/>
     <w:p>
       <w:pPr>
-        <w:spacing w:before="280" w:after="80"/>
+        <w:spacing w:before="360" w:after="160"/>
+        <w:pBdr>
+          <w:bottom w:val="single" w:sz="4" w:space="1" w:color="003D6B"/>
+        </w:pBdr>
       </w:pPr>
       <w:r>
         <w:rPr>
+          <w:rFonts w:ascii="Calibri" w:hAnsi="Calibri"/>
           <w:b/>
-          <w:color w:val="635BFF"/>
-          <w:sz w:val="26"/>
+          <w:color w:val="003D6B"/>
+          <w:sz w:val="24"/>
         </w:rPr>
         <w:t>4. Features (v0.1)</w:t>
       </w:r>
@@ -882,22 +1051,32 @@
         <w:tblW w:type="auto" w:w="0"/>
         <w:tblLayout w:type="fixed"/>
         <w:tblLook w:firstColumn="1" w:firstRow="1" w:lastColumn="0" w:lastRow="0" w:noHBand="0" w:noVBand="1" w:val="04A0"/>
+        <w:tblBorders>
+          <w:top w:val="single" w:sz="4" w:space="0" w:color="999999"/>
+          <w:left w:val="single" w:sz="4" w:space="0" w:color="999999"/>
+          <w:bottom w:val="single" w:sz="4" w:space="0" w:color="999999"/>
+          <w:right w:val="single" w:sz="4" w:space="0" w:color="999999"/>
+          <w:insideH w:val="single" w:sz="4" w:space="0" w:color="999999"/>
+          <w:insideV w:val="single" w:sz="4" w:space="0" w:color="999999"/>
+        </w:tblBorders>
       </w:tblPr>
       <w:tblGrid>
-        <w:gridCol w:w="4824"/>
-        <w:gridCol w:w="4824"/>
+        <w:gridCol w:w="4680"/>
+        <w:gridCol w:w="4680"/>
       </w:tblGrid>
       <w:tr>
         <w:tc>
           <w:tcPr>
-            <w:tcW w:type="dxa" w:w="7200"/>
-            <w:shd w:val="clear" w:color="auto" w:fill="F0F1FF"/>
+            <w:tcW w:type="dxa" w:w="6768"/>
+            <w:shd w:fill="003D6B" w:val="clear"/>
           </w:tcPr>
           <w:p>
+            <w:r/>
             <w:r>
               <w:rPr>
+                <w:rFonts w:ascii="Calibri" w:hAnsi="Calibri"/>
                 <w:b/>
-                <w:color w:val="635BFF"/>
+                <w:color w:val="FFFFFF"/>
                 <w:sz w:val="18"/>
               </w:rPr>
               <w:t>Feature</w:t>
@@ -906,14 +1085,16 @@
         </w:tc>
         <w:tc>
           <w:tcPr>
-            <w:tcW w:type="dxa" w:w="2448"/>
-            <w:shd w:val="clear" w:color="auto" w:fill="F0F1FF"/>
+            <w:tcW w:type="dxa" w:w="2592"/>
+            <w:shd w:fill="003D6B" w:val="clear"/>
           </w:tcPr>
           <w:p>
+            <w:r/>
             <w:r>
               <w:rPr>
+                <w:rFonts w:ascii="Calibri" w:hAnsi="Calibri"/>
                 <w:b/>
-                <w:color w:val="635BFF"/>
+                <w:color w:val="FFFFFF"/>
                 <w:sz w:val="18"/>
               </w:rPr>
               <w:t>Status</w:t>
@@ -924,13 +1105,15 @@
       <w:tr>
         <w:tc>
           <w:tcPr>
-            <w:tcW w:type="dxa" w:w="7200"/>
+            <w:tcW w:type="dxa" w:w="6768"/>
           </w:tcPr>
           <w:p>
+            <w:r/>
             <w:r>
               <w:rPr>
-                <w:color w:val="425466"/>
-                <w:sz w:val="19"/>
+                <w:rFonts w:ascii="Calibri" w:hAnsi="Calibri"/>
+                <w:color w:val="333333"/>
+                <w:sz w:val="18"/>
               </w:rPr>
               <w:t>50-school roster (Gujranwala-50), EMIS + lat/lon</w:t>
             </w:r>
@@ -938,13 +1121,15 @@
         </w:tc>
         <w:tc>
           <w:tcPr>
-            <w:tcW w:type="dxa" w:w="2448"/>
+            <w:tcW w:type="dxa" w:w="2592"/>
           </w:tcPr>
           <w:p>
+            <w:r/>
             <w:r>
               <w:rPr>
-                <w:color w:val="425466"/>
-                <w:sz w:val="19"/>
+                <w:rFonts w:ascii="Calibri" w:hAnsi="Calibri"/>
+                <w:color w:val="333333"/>
+                <w:sz w:val="18"/>
               </w:rPr>
               <w:t>Done</w:t>
             </w:r>
@@ -954,13 +1139,16 @@
       <w:tr>
         <w:tc>
           <w:tcPr>
-            <w:tcW w:type="dxa" w:w="7200"/>
+            <w:tcW w:type="dxa" w:w="6768"/>
+            <w:shd w:fill="F2F2F2" w:val="clear"/>
           </w:tcPr>
           <w:p>
+            <w:r/>
             <w:r>
               <w:rPr>
-                <w:color w:val="425466"/>
-                <w:sz w:val="19"/>
+                <w:rFonts w:ascii="Calibri" w:hAnsi="Calibri"/>
+                <w:color w:val="333333"/>
+                <w:sz w:val="18"/>
               </w:rPr>
               <w:t>Daily ingest: ERA5 / MODIS LST / Sentinel-5P / CAMS / GloFAS</w:t>
             </w:r>
@@ -968,13 +1156,16 @@
         </w:tc>
         <w:tc>
           <w:tcPr>
-            <w:tcW w:type="dxa" w:w="2448"/>
+            <w:tcW w:type="dxa" w:w="2592"/>
+            <w:shd w:fill="F2F2F2" w:val="clear"/>
           </w:tcPr>
           <w:p>
+            <w:r/>
             <w:r>
               <w:rPr>
-                <w:color w:val="425466"/>
-                <w:sz w:val="19"/>
+                <w:rFonts w:ascii="Calibri" w:hAnsi="Calibri"/>
+                <w:color w:val="333333"/>
+                <w:sz w:val="18"/>
               </w:rPr>
               <w:t>Code stubbed</w:t>
             </w:r>
@@ -984,13 +1175,15 @@
       <w:tr>
         <w:tc>
           <w:tcPr>
-            <w:tcW w:type="dxa" w:w="7200"/>
+            <w:tcW w:type="dxa" w:w="6768"/>
           </w:tcPr>
           <w:p>
+            <w:r/>
             <w:r>
               <w:rPr>
-                <w:color w:val="425466"/>
-                <w:sz w:val="19"/>
+                <w:rFonts w:ascii="Calibri" w:hAnsi="Calibri"/>
+                <w:color w:val="333333"/>
+                <w:sz w:val="18"/>
               </w:rPr>
               <w:t>Per-school hazard scoring (heat / AQ / flood / overall) 0–100</w:t>
             </w:r>
@@ -998,13 +1191,15 @@
         </w:tc>
         <w:tc>
           <w:tcPr>
-            <w:tcW w:type="dxa" w:w="2448"/>
+            <w:tcW w:type="dxa" w:w="2592"/>
           </w:tcPr>
           <w:p>
+            <w:r/>
             <w:r>
               <w:rPr>
-                <w:color w:val="425466"/>
-                <w:sz w:val="19"/>
+                <w:rFonts w:ascii="Calibri" w:hAnsi="Calibri"/>
+                <w:color w:val="333333"/>
+                <w:sz w:val="18"/>
               </w:rPr>
               <w:t>Mock</w:t>
             </w:r>
@@ -1014,13 +1209,16 @@
       <w:tr>
         <w:tc>
           <w:tcPr>
-            <w:tcW w:type="dxa" w:w="7200"/>
+            <w:tcW w:type="dxa" w:w="6768"/>
+            <w:shd w:fill="F2F2F2" w:val="clear"/>
           </w:tcPr>
           <w:p>
+            <w:r/>
             <w:r>
               <w:rPr>
-                <w:color w:val="425466"/>
-                <w:sz w:val="19"/>
+                <w:rFonts w:ascii="Calibri" w:hAnsi="Calibri"/>
+                <w:color w:val="333333"/>
+                <w:sz w:val="18"/>
               </w:rPr>
               <w:t>Child-burden estimator (students × hazard-days)</w:t>
             </w:r>
@@ -1028,13 +1226,16 @@
         </w:tc>
         <w:tc>
           <w:tcPr>
-            <w:tcW w:type="dxa" w:w="2448"/>
+            <w:tcW w:type="dxa" w:w="2592"/>
+            <w:shd w:fill="F2F2F2" w:val="clear"/>
           </w:tcPr>
           <w:p>
+            <w:r/>
             <w:r>
               <w:rPr>
-                <w:color w:val="425466"/>
-                <w:sz w:val="19"/>
+                <w:rFonts w:ascii="Calibri" w:hAnsi="Calibri"/>
+                <w:color w:val="333333"/>
+                <w:sz w:val="18"/>
               </w:rPr>
               <w:t>Mock</w:t>
             </w:r>
@@ -1044,13 +1245,15 @@
       <w:tr>
         <w:tc>
           <w:tcPr>
-            <w:tcW w:type="dxa" w:w="7200"/>
+            <w:tcW w:type="dxa" w:w="6768"/>
           </w:tcPr>
           <w:p>
+            <w:r/>
             <w:r>
               <w:rPr>
-                <w:color w:val="425466"/>
-                <w:sz w:val="19"/>
+                <w:rFonts w:ascii="Calibri" w:hAnsi="Calibri"/>
+                <w:color w:val="333333"/>
+                <w:sz w:val="18"/>
               </w:rPr>
               <w:t>Active-alert detection at configurable thresholds</w:t>
             </w:r>
@@ -1058,13 +1261,15 @@
         </w:tc>
         <w:tc>
           <w:tcPr>
-            <w:tcW w:type="dxa" w:w="2448"/>
+            <w:tcW w:type="dxa" w:w="2592"/>
           </w:tcPr>
           <w:p>
+            <w:r/>
             <w:r>
               <w:rPr>
-                <w:color w:val="425466"/>
-                <w:sz w:val="19"/>
+                <w:rFonts w:ascii="Calibri" w:hAnsi="Calibri"/>
+                <w:color w:val="333333"/>
+                <w:sz w:val="18"/>
               </w:rPr>
               <w:t>Mock</w:t>
             </w:r>
@@ -1074,13 +1279,16 @@
       <w:tr>
         <w:tc>
           <w:tcPr>
-            <w:tcW w:type="dxa" w:w="7200"/>
+            <w:tcW w:type="dxa" w:w="6768"/>
+            <w:shd w:fill="F2F2F2" w:val="clear"/>
           </w:tcPr>
           <w:p>
+            <w:r/>
             <w:r>
               <w:rPr>
-                <w:color w:val="425466"/>
-                <w:sz w:val="19"/>
+                <w:rFonts w:ascii="Calibri" w:hAnsi="Calibri"/>
+                <w:color w:val="333333"/>
+                <w:sz w:val="18"/>
               </w:rPr>
               <w:t>Multilingual advisory engine (EN / UR / Punjabi-Shahmukhi)</w:t>
             </w:r>
@@ -1088,13 +1296,16 @@
         </w:tc>
         <w:tc>
           <w:tcPr>
-            <w:tcW w:type="dxa" w:w="2448"/>
+            <w:tcW w:type="dxa" w:w="2592"/>
+            <w:shd w:fill="F2F2F2" w:val="clear"/>
           </w:tcPr>
           <w:p>
+            <w:r/>
             <w:r>
               <w:rPr>
-                <w:color w:val="425466"/>
-                <w:sz w:val="19"/>
+                <w:rFonts w:ascii="Calibri" w:hAnsi="Calibri"/>
+                <w:color w:val="333333"/>
+                <w:sz w:val="18"/>
               </w:rPr>
               <w:t>Mock content</w:t>
             </w:r>
@@ -1104,13 +1315,15 @@
       <w:tr>
         <w:tc>
           <w:tcPr>
-            <w:tcW w:type="dxa" w:w="7200"/>
+            <w:tcW w:type="dxa" w:w="6768"/>
           </w:tcPr>
           <w:p>
+            <w:r/>
             <w:r>
               <w:rPr>
-                <w:color w:val="425466"/>
-                <w:sz w:val="19"/>
+                <w:rFonts w:ascii="Calibri" w:hAnsi="Calibri"/>
+                <w:color w:val="333333"/>
+                <w:sz w:val="18"/>
               </w:rPr>
               <w:t>Operator approval workflow before dispatch</w:t>
             </w:r>
@@ -1118,13 +1331,15 @@
         </w:tc>
         <w:tc>
           <w:tcPr>
-            <w:tcW w:type="dxa" w:w="2448"/>
+            <w:tcW w:type="dxa" w:w="2592"/>
           </w:tcPr>
           <w:p>
+            <w:r/>
             <w:r>
               <w:rPr>
-                <w:color w:val="425466"/>
-                <w:sz w:val="19"/>
+                <w:rFonts w:ascii="Calibri" w:hAnsi="Calibri"/>
+                <w:color w:val="333333"/>
+                <w:sz w:val="18"/>
               </w:rPr>
               <w:t>UI complete</w:t>
             </w:r>
@@ -1134,13 +1349,16 @@
       <w:tr>
         <w:tc>
           <w:tcPr>
-            <w:tcW w:type="dxa" w:w="7200"/>
+            <w:tcW w:type="dxa" w:w="6768"/>
+            <w:shd w:fill="F2F2F2" w:val="clear"/>
           </w:tcPr>
           <w:p>
+            <w:r/>
             <w:r>
               <w:rPr>
-                <w:color w:val="425466"/>
-                <w:sz w:val="19"/>
+                <w:rFonts w:ascii="Calibri" w:hAnsi="Calibri"/>
+                <w:color w:val="333333"/>
+                <w:sz w:val="18"/>
               </w:rPr>
               <w:t>Dispatch via SMS / WhatsApp / school PA gateway</w:t>
             </w:r>
@@ -1148,13 +1366,16 @@
         </w:tc>
         <w:tc>
           <w:tcPr>
-            <w:tcW w:type="dxa" w:w="2448"/>
+            <w:tcW w:type="dxa" w:w="2592"/>
+            <w:shd w:fill="F2F2F2" w:val="clear"/>
           </w:tcPr>
           <w:p>
+            <w:r/>
             <w:r>
               <w:rPr>
-                <w:color w:val="425466"/>
-                <w:sz w:val="19"/>
+                <w:rFonts w:ascii="Calibri" w:hAnsi="Calibri"/>
+                <w:color w:val="333333"/>
+                <w:sz w:val="18"/>
               </w:rPr>
               <w:t>Stubbed</w:t>
             </w:r>
@@ -1164,13 +1385,15 @@
       <w:tr>
         <w:tc>
           <w:tcPr>
-            <w:tcW w:type="dxa" w:w="7200"/>
+            <w:tcW w:type="dxa" w:w="6768"/>
           </w:tcPr>
           <w:p>
+            <w:r/>
             <w:r>
               <w:rPr>
-                <w:color w:val="425466"/>
-                <w:sz w:val="19"/>
+                <w:rFonts w:ascii="Calibri" w:hAnsi="Calibri"/>
+                <w:color w:val="333333"/>
+                <w:sz w:val="18"/>
               </w:rPr>
               <w:t>Audit log of decisions + dispatches</w:t>
             </w:r>
@@ -1178,13 +1401,15 @@
         </w:tc>
         <w:tc>
           <w:tcPr>
-            <w:tcW w:type="dxa" w:w="2448"/>
+            <w:tcW w:type="dxa" w:w="2592"/>
           </w:tcPr>
           <w:p>
+            <w:r/>
             <w:r>
               <w:rPr>
-                <w:color w:val="425466"/>
-                <w:sz w:val="19"/>
+                <w:rFonts w:ascii="Calibri" w:hAnsi="Calibri"/>
+                <w:color w:val="333333"/>
+                <w:sz w:val="18"/>
               </w:rPr>
               <w:t>Schema only</w:t>
             </w:r>
@@ -1194,13 +1419,16 @@
       <w:tr>
         <w:tc>
           <w:tcPr>
-            <w:tcW w:type="dxa" w:w="7200"/>
+            <w:tcW w:type="dxa" w:w="6768"/>
+            <w:shd w:fill="F2F2F2" w:val="clear"/>
           </w:tcPr>
           <w:p>
+            <w:r/>
             <w:r>
               <w:rPr>
-                <w:color w:val="425466"/>
-                <w:sz w:val="19"/>
+                <w:rFonts w:ascii="Calibri" w:hAnsi="Calibri"/>
+                <w:color w:val="333333"/>
+                <w:sz w:val="18"/>
               </w:rPr>
               <w:t>Open Data Layer — daily refresh, CC BY 4.0</w:t>
             </w:r>
@@ -1208,13 +1436,16 @@
         </w:tc>
         <w:tc>
           <w:tcPr>
-            <w:tcW w:type="dxa" w:w="2448"/>
+            <w:tcW w:type="dxa" w:w="2592"/>
+            <w:shd w:fill="F2F2F2" w:val="clear"/>
           </w:tcPr>
           <w:p>
+            <w:r/>
             <w:r>
               <w:rPr>
-                <w:color w:val="425466"/>
-                <w:sz w:val="19"/>
+                <w:rFonts w:ascii="Calibri" w:hAnsi="Calibri"/>
+                <w:color w:val="333333"/>
+                <w:sz w:val="18"/>
               </w:rPr>
               <w:t>Schema only</w:t>
             </w:r>
@@ -1224,13 +1455,15 @@
       <w:tr>
         <w:tc>
           <w:tcPr>
-            <w:tcW w:type="dxa" w:w="7200"/>
+            <w:tcW w:type="dxa" w:w="6768"/>
           </w:tcPr>
           <w:p>
+            <w:r/>
             <w:r>
               <w:rPr>
-                <w:color w:val="425466"/>
-                <w:sz w:val="19"/>
+                <w:rFonts w:ascii="Calibri" w:hAnsi="Calibri"/>
+                <w:color w:val="333333"/>
+                <w:sz w:val="18"/>
               </w:rPr>
               <w:t>Score explainability (SHAP-style feature attribution)</w:t>
             </w:r>
@@ -1238,13 +1471,15 @@
         </w:tc>
         <w:tc>
           <w:tcPr>
-            <w:tcW w:type="dxa" w:w="2448"/>
+            <w:tcW w:type="dxa" w:w="2592"/>
           </w:tcPr>
           <w:p>
+            <w:r/>
             <w:r>
               <w:rPr>
-                <w:color w:val="425466"/>
-                <w:sz w:val="19"/>
+                <w:rFonts w:ascii="Calibri" w:hAnsi="Calibri"/>
+                <w:color w:val="333333"/>
+                <w:sz w:val="18"/>
               </w:rPr>
               <w:t>Mock</w:t>
             </w:r>
@@ -1254,13 +1489,16 @@
       <w:tr>
         <w:tc>
           <w:tcPr>
-            <w:tcW w:type="dxa" w:w="7200"/>
+            <w:tcW w:type="dxa" w:w="6768"/>
+            <w:shd w:fill="F2F2F2" w:val="clear"/>
           </w:tcPr>
           <w:p>
+            <w:r/>
             <w:r>
               <w:rPr>
-                <w:color w:val="425466"/>
-                <w:sz w:val="19"/>
+                <w:rFonts w:ascii="Calibri" w:hAnsi="Calibri"/>
+                <w:color w:val="333333"/>
+                <w:sz w:val="18"/>
               </w:rPr>
               <w:t>Natural-language chat (⌘K) over the data</w:t>
             </w:r>
@@ -1268,13 +1506,16 @@
         </w:tc>
         <w:tc>
           <w:tcPr>
-            <w:tcW w:type="dxa" w:w="2448"/>
+            <w:tcW w:type="dxa" w:w="2592"/>
+            <w:shd w:fill="F2F2F2" w:val="clear"/>
           </w:tcPr>
           <w:p>
+            <w:r/>
             <w:r>
               <w:rPr>
-                <w:color w:val="425466"/>
-                <w:sz w:val="19"/>
+                <w:rFonts w:ascii="Calibri" w:hAnsi="Calibri"/>
+                <w:color w:val="333333"/>
+                <w:sz w:val="18"/>
               </w:rPr>
               <w:t>Scripted demo</w:t>
             </w:r>
@@ -1284,13 +1525,15 @@
       <w:tr>
         <w:tc>
           <w:tcPr>
-            <w:tcW w:type="dxa" w:w="7200"/>
+            <w:tcW w:type="dxa" w:w="6768"/>
           </w:tcPr>
           <w:p>
+            <w:r/>
             <w:r>
               <w:rPr>
-                <w:color w:val="425466"/>
-                <w:sz w:val="19"/>
+                <w:rFonts w:ascii="Calibri" w:hAnsi="Calibri"/>
+                <w:color w:val="333333"/>
+                <w:sz w:val="18"/>
               </w:rPr>
               <w:t>Theme: light / dark / system</w:t>
             </w:r>
@@ -1298,13 +1541,15 @@
         </w:tc>
         <w:tc>
           <w:tcPr>
-            <w:tcW w:type="dxa" w:w="2448"/>
+            <w:tcW w:type="dxa" w:w="2592"/>
           </w:tcPr>
           <w:p>
+            <w:r/>
             <w:r>
               <w:rPr>
-                <w:color w:val="425466"/>
-                <w:sz w:val="19"/>
+                <w:rFonts w:ascii="Calibri" w:hAnsi="Calibri"/>
+                <w:color w:val="333333"/>
+                <w:sz w:val="18"/>
               </w:rPr>
               <w:t>Done</w:t>
             </w:r>
@@ -1314,13 +1559,16 @@
       <w:tr>
         <w:tc>
           <w:tcPr>
-            <w:tcW w:type="dxa" w:w="7200"/>
+            <w:tcW w:type="dxa" w:w="6768"/>
+            <w:shd w:fill="F2F2F2" w:val="clear"/>
           </w:tcPr>
           <w:p>
+            <w:r/>
             <w:r>
               <w:rPr>
-                <w:color w:val="425466"/>
-                <w:sz w:val="19"/>
+                <w:rFonts w:ascii="Calibri" w:hAnsi="Calibri"/>
+                <w:color w:val="333333"/>
+                <w:sz w:val="18"/>
               </w:rPr>
               <w:t>Cluster-level broadcast</w:t>
             </w:r>
@@ -1328,13 +1576,16 @@
         </w:tc>
         <w:tc>
           <w:tcPr>
-            <w:tcW w:type="dxa" w:w="2448"/>
+            <w:tcW w:type="dxa" w:w="2592"/>
+            <w:shd w:fill="F2F2F2" w:val="clear"/>
           </w:tcPr>
           <w:p>
+            <w:r/>
             <w:r>
               <w:rPr>
-                <w:color w:val="425466"/>
-                <w:sz w:val="19"/>
+                <w:rFonts w:ascii="Calibri" w:hAnsi="Calibri"/>
+                <w:color w:val="333333"/>
+                <w:sz w:val="18"/>
               </w:rPr>
               <w:t>UI complete</w:t>
             </w:r>
@@ -1342,15 +1593,20 @@
         </w:tc>
       </w:tr>
     </w:tbl>
+    <w:p/>
     <w:p>
       <w:pPr>
-        <w:spacing w:before="280" w:after="80"/>
+        <w:spacing w:before="360" w:after="160"/>
+        <w:pBdr>
+          <w:bottom w:val="single" w:sz="4" w:space="1" w:color="003D6B"/>
+        </w:pBdr>
       </w:pPr>
       <w:r>
         <w:rPr>
+          <w:rFonts w:ascii="Calibri" w:hAnsi="Calibri"/>
           <w:b/>
-          <w:color w:val="635BFF"/>
-          <w:sz w:val="26"/>
+          <w:color w:val="003D6B"/>
+          <w:sz w:val="24"/>
         </w:rPr>
         <w:t>5. Functional requirements</w:t>
       </w:r>
@@ -1360,22 +1616,32 @@
         <w:tblW w:type="auto" w:w="0"/>
         <w:tblLayout w:type="fixed"/>
         <w:tblLook w:firstColumn="1" w:firstRow="1" w:lastColumn="0" w:lastRow="0" w:noHBand="0" w:noVBand="1" w:val="04A0"/>
+        <w:tblBorders>
+          <w:top w:val="single" w:sz="4" w:space="0" w:color="999999"/>
+          <w:left w:val="single" w:sz="4" w:space="0" w:color="999999"/>
+          <w:bottom w:val="single" w:sz="4" w:space="0" w:color="999999"/>
+          <w:right w:val="single" w:sz="4" w:space="0" w:color="999999"/>
+          <w:insideH w:val="single" w:sz="4" w:space="0" w:color="999999"/>
+          <w:insideV w:val="single" w:sz="4" w:space="0" w:color="999999"/>
+        </w:tblBorders>
       </w:tblPr>
       <w:tblGrid>
-        <w:gridCol w:w="4824"/>
-        <w:gridCol w:w="4824"/>
+        <w:gridCol w:w="4680"/>
+        <w:gridCol w:w="4680"/>
       </w:tblGrid>
       <w:tr>
         <w:tc>
           <w:tcPr>
             <w:tcW w:type="dxa" w:w="1008"/>
-            <w:shd w:val="clear" w:color="auto" w:fill="F0F1FF"/>
+            <w:shd w:fill="003D6B" w:val="clear"/>
           </w:tcPr>
           <w:p>
+            <w:r/>
             <w:r>
               <w:rPr>
+                <w:rFonts w:ascii="Calibri" w:hAnsi="Calibri"/>
                 <w:b/>
-                <w:color w:val="635BFF"/>
+                <w:color w:val="FFFFFF"/>
                 <w:sz w:val="18"/>
               </w:rPr>
               <w:t>#</w:t>
@@ -1384,14 +1650,16 @@
         </w:tc>
         <w:tc>
           <w:tcPr>
-            <w:tcW w:type="dxa" w:w="8640"/>
-            <w:shd w:val="clear" w:color="auto" w:fill="F0F1FF"/>
+            <w:tcW w:type="dxa" w:w="8352"/>
+            <w:shd w:fill="003D6B" w:val="clear"/>
           </w:tcPr>
           <w:p>
+            <w:r/>
             <w:r>
               <w:rPr>
+                <w:rFonts w:ascii="Calibri" w:hAnsi="Calibri"/>
                 <w:b/>
-                <w:color w:val="635BFF"/>
+                <w:color w:val="FFFFFF"/>
                 <w:sz w:val="18"/>
               </w:rPr>
               <w:t>Requirement</w:t>
@@ -1405,10 +1673,12 @@
             <w:tcW w:type="dxa" w:w="1008"/>
           </w:tcPr>
           <w:p>
+            <w:r/>
             <w:r>
               <w:rPr>
-                <w:color w:val="425466"/>
-                <w:sz w:val="19"/>
+                <w:rFonts w:ascii="Calibri" w:hAnsi="Calibri"/>
+                <w:color w:val="333333"/>
+                <w:sz w:val="18"/>
               </w:rPr>
               <w:t>FR-1</w:t>
             </w:r>
@@ -1416,13 +1686,15 @@
         </w:tc>
         <w:tc>
           <w:tcPr>
-            <w:tcW w:type="dxa" w:w="8640"/>
+            <w:tcW w:type="dxa" w:w="8352"/>
           </w:tcPr>
           <w:p>
+            <w:r/>
             <w:r>
               <w:rPr>
-                <w:color w:val="425466"/>
-                <w:sz w:val="19"/>
+                <w:rFonts w:ascii="Calibri" w:hAnsi="Calibri"/>
+                <w:color w:val="333333"/>
+                <w:sz w:val="18"/>
               </w:rPr>
               <w:t>Display all 50 schools on a Leaflet map with hazard-coloured markers</w:t>
             </w:r>
@@ -1433,12 +1705,15 @@
         <w:tc>
           <w:tcPr>
             <w:tcW w:type="dxa" w:w="1008"/>
+            <w:shd w:fill="F2F2F2" w:val="clear"/>
           </w:tcPr>
           <w:p>
+            <w:r/>
             <w:r>
               <w:rPr>
-                <w:color w:val="425466"/>
-                <w:sz w:val="19"/>
+                <w:rFonts w:ascii="Calibri" w:hAnsi="Calibri"/>
+                <w:color w:val="333333"/>
+                <w:sz w:val="18"/>
               </w:rPr>
               <w:t>FR-2</w:t>
             </w:r>
@@ -1446,13 +1721,16 @@
         </w:tc>
         <w:tc>
           <w:tcPr>
-            <w:tcW w:type="dxa" w:w="8640"/>
+            <w:tcW w:type="dxa" w:w="8352"/>
+            <w:shd w:fill="F2F2F2" w:val="clear"/>
           </w:tcPr>
           <w:p>
+            <w:r/>
             <w:r>
               <w:rPr>
-                <w:color w:val="425466"/>
-                <w:sz w:val="19"/>
+                <w:rFonts w:ascii="Calibri" w:hAnsi="Calibri"/>
+                <w:color w:val="333333"/>
+                <w:sz w:val="18"/>
               </w:rPr>
               <w:t>Switch map layer: heat / air-quality / flood / overall</w:t>
             </w:r>
@@ -1465,10 +1743,12 @@
             <w:tcW w:type="dxa" w:w="1008"/>
           </w:tcPr>
           <w:p>
+            <w:r/>
             <w:r>
               <w:rPr>
-                <w:color w:val="425466"/>
-                <w:sz w:val="19"/>
+                <w:rFonts w:ascii="Calibri" w:hAnsi="Calibri"/>
+                <w:color w:val="333333"/>
+                <w:sz w:val="18"/>
               </w:rPr>
               <w:t>FR-3</w:t>
             </w:r>
@@ -1476,13 +1756,15 @@
         </w:tc>
         <w:tc>
           <w:tcPr>
-            <w:tcW w:type="dxa" w:w="8640"/>
+            <w:tcW w:type="dxa" w:w="8352"/>
           </w:tcPr>
           <w:p>
+            <w:r/>
             <w:r>
               <w:rPr>
-                <w:color w:val="425466"/>
-                <w:sz w:val="19"/>
+                <w:rFonts w:ascii="Calibri" w:hAnsi="Calibri"/>
+                <w:color w:val="333333"/>
+                <w:sz w:val="18"/>
               </w:rPr>
               <w:t>Filter by cluster (C-1 to C-4)</w:t>
             </w:r>
@@ -1493,12 +1775,15 @@
         <w:tc>
           <w:tcPr>
             <w:tcW w:type="dxa" w:w="1008"/>
+            <w:shd w:fill="F2F2F2" w:val="clear"/>
           </w:tcPr>
           <w:p>
+            <w:r/>
             <w:r>
               <w:rPr>
-                <w:color w:val="425466"/>
-                <w:sz w:val="19"/>
+                <w:rFonts w:ascii="Calibri" w:hAnsi="Calibri"/>
+                <w:color w:val="333333"/>
+                <w:sz w:val="18"/>
               </w:rPr>
               <w:t>FR-4</w:t>
             </w:r>
@@ -1506,13 +1791,16 @@
         </w:tc>
         <w:tc>
           <w:tcPr>
-            <w:tcW w:type="dxa" w:w="8640"/>
+            <w:tcW w:type="dxa" w:w="8352"/>
+            <w:shd w:fill="F2F2F2" w:val="clear"/>
           </w:tcPr>
           <w:p>
+            <w:r/>
             <w:r>
               <w:rPr>
-                <w:color w:val="425466"/>
-                <w:sz w:val="19"/>
+                <w:rFonts w:ascii="Calibri" w:hAnsi="Calibri"/>
+                <w:color w:val="333333"/>
+                <w:sz w:val="18"/>
               </w:rPr>
               <w:t>Show child-burden estimate as the hero metric on Overview</w:t>
             </w:r>
@@ -1525,10 +1813,12 @@
             <w:tcW w:type="dxa" w:w="1008"/>
           </w:tcPr>
           <w:p>
+            <w:r/>
             <w:r>
               <w:rPr>
-                <w:color w:val="425466"/>
-                <w:sz w:val="19"/>
+                <w:rFonts w:ascii="Calibri" w:hAnsi="Calibri"/>
+                <w:color w:val="333333"/>
+                <w:sz w:val="18"/>
               </w:rPr>
               <w:t>FR-5</w:t>
             </w:r>
@@ -1536,13 +1826,15 @@
         </w:tc>
         <w:tc>
           <w:tcPr>
-            <w:tcW w:type="dxa" w:w="8640"/>
+            <w:tcW w:type="dxa" w:w="8352"/>
           </w:tcPr>
           <w:p>
+            <w:r/>
             <w:r>
               <w:rPr>
-                <w:color w:val="425466"/>
-                <w:sz w:val="19"/>
+                <w:rFonts w:ascii="Calibri" w:hAnsi="Calibri"/>
+                <w:color w:val="333333"/>
+                <w:sz w:val="18"/>
               </w:rPr>
               <w:t>Surface active alerts (overall ≥80) ranked by severity × students-affected</w:t>
             </w:r>
@@ -1553,12 +1845,15 @@
         <w:tc>
           <w:tcPr>
             <w:tcW w:type="dxa" w:w="1008"/>
+            <w:shd w:fill="F2F2F2" w:val="clear"/>
           </w:tcPr>
           <w:p>
+            <w:r/>
             <w:r>
               <w:rPr>
-                <w:color w:val="425466"/>
-                <w:sz w:val="19"/>
+                <w:rFonts w:ascii="Calibri" w:hAnsi="Calibri"/>
+                <w:color w:val="333333"/>
+                <w:sz w:val="18"/>
               </w:rPr>
               <w:t>FR-6</w:t>
             </w:r>
@@ -1566,13 +1861,16 @@
         </w:tc>
         <w:tc>
           <w:tcPr>
-            <w:tcW w:type="dxa" w:w="8640"/>
+            <w:tcW w:type="dxa" w:w="8352"/>
+            <w:shd w:fill="F2F2F2" w:val="clear"/>
           </w:tcPr>
           <w:p>
+            <w:r/>
             <w:r>
               <w:rPr>
-                <w:color w:val="425466"/>
-                <w:sz w:val="19"/>
+                <w:rFonts w:ascii="Calibri" w:hAnsi="Calibri"/>
+                <w:color w:val="333333"/>
+                <w:sz w:val="18"/>
               </w:rPr>
               <w:t>Open dispatch modal showing auto-drafted EN/UR/PA advisory text</w:t>
             </w:r>
@@ -1585,10 +1883,12 @@
             <w:tcW w:type="dxa" w:w="1008"/>
           </w:tcPr>
           <w:p>
+            <w:r/>
             <w:r>
               <w:rPr>
-                <w:color w:val="425466"/>
-                <w:sz w:val="19"/>
+                <w:rFonts w:ascii="Calibri" w:hAnsi="Calibri"/>
+                <w:color w:val="333333"/>
+                <w:sz w:val="18"/>
               </w:rPr>
               <w:t>FR-7</w:t>
             </w:r>
@@ -1596,13 +1896,15 @@
         </w:tc>
         <w:tc>
           <w:tcPr>
-            <w:tcW w:type="dxa" w:w="8640"/>
+            <w:tcW w:type="dxa" w:w="8352"/>
           </w:tcPr>
           <w:p>
+            <w:r/>
             <w:r>
               <w:rPr>
-                <w:color w:val="425466"/>
-                <w:sz w:val="19"/>
+                <w:rFonts w:ascii="Calibri" w:hAnsi="Calibri"/>
+                <w:color w:val="333333"/>
+                <w:sz w:val="18"/>
               </w:rPr>
               <w:t>Channel selection (SMS / WhatsApp / school PA) before send</w:t>
             </w:r>
@@ -1613,12 +1915,15 @@
         <w:tc>
           <w:tcPr>
             <w:tcW w:type="dxa" w:w="1008"/>
+            <w:shd w:fill="F2F2F2" w:val="clear"/>
           </w:tcPr>
           <w:p>
+            <w:r/>
             <w:r>
               <w:rPr>
-                <w:color w:val="425466"/>
-                <w:sz w:val="19"/>
+                <w:rFonts w:ascii="Calibri" w:hAnsi="Calibri"/>
+                <w:color w:val="333333"/>
+                <w:sz w:val="18"/>
               </w:rPr>
               <w:t>FR-8</w:t>
             </w:r>
@@ -1626,13 +1931,16 @@
         </w:tc>
         <w:tc>
           <w:tcPr>
-            <w:tcW w:type="dxa" w:w="8640"/>
+            <w:tcW w:type="dxa" w:w="8352"/>
+            <w:shd w:fill="F2F2F2" w:val="clear"/>
           </w:tcPr>
           <w:p>
+            <w:r/>
             <w:r>
               <w:rPr>
-                <w:color w:val="425466"/>
-                <w:sz w:val="19"/>
+                <w:rFonts w:ascii="Calibri" w:hAnsi="Calibri"/>
+                <w:color w:val="333333"/>
+                <w:sz w:val="18"/>
               </w:rPr>
               <w:t>"Modify school day" modal with adjustment checklist</w:t>
             </w:r>
@@ -1645,10 +1953,12 @@
             <w:tcW w:type="dxa" w:w="1008"/>
           </w:tcPr>
           <w:p>
+            <w:r/>
             <w:r>
               <w:rPr>
-                <w:color w:val="425466"/>
-                <w:sz w:val="19"/>
+                <w:rFonts w:ascii="Calibri" w:hAnsi="Calibri"/>
+                <w:color w:val="333333"/>
+                <w:sz w:val="18"/>
               </w:rPr>
               <w:t>FR-9</w:t>
             </w:r>
@@ -1656,13 +1966,15 @@
         </w:tc>
         <w:tc>
           <w:tcPr>
-            <w:tcW w:type="dxa" w:w="8640"/>
+            <w:tcW w:type="dxa" w:w="8352"/>
           </w:tcPr>
           <w:p>
+            <w:r/>
             <w:r>
               <w:rPr>
-                <w:color w:val="425466"/>
-                <w:sz w:val="19"/>
+                <w:rFonts w:ascii="Calibri" w:hAnsi="Calibri"/>
+                <w:color w:val="333333"/>
+                <w:sz w:val="18"/>
               </w:rPr>
               <w:t>"Defer 24h" action that re-queues the alert tomorrow</w:t>
             </w:r>
@@ -1673,12 +1985,15 @@
         <w:tc>
           <w:tcPr>
             <w:tcW w:type="dxa" w:w="1008"/>
+            <w:shd w:fill="F2F2F2" w:val="clear"/>
           </w:tcPr>
           <w:p>
+            <w:r/>
             <w:r>
               <w:rPr>
-                <w:color w:val="425466"/>
-                <w:sz w:val="19"/>
+                <w:rFonts w:ascii="Calibri" w:hAnsi="Calibri"/>
+                <w:color w:val="333333"/>
+                <w:sz w:val="18"/>
               </w:rPr>
               <w:t>FR-10</w:t>
             </w:r>
@@ -1686,13 +2001,16 @@
         </w:tc>
         <w:tc>
           <w:tcPr>
-            <w:tcW w:type="dxa" w:w="8640"/>
+            <w:tcW w:type="dxa" w:w="8352"/>
+            <w:shd w:fill="F2F2F2" w:val="clear"/>
           </w:tcPr>
           <w:p>
+            <w:r/>
             <w:r>
               <w:rPr>
-                <w:color w:val="425466"/>
-                <w:sz w:val="19"/>
+                <w:rFonts w:ascii="Calibri" w:hAnsi="Calibri"/>
+                <w:color w:val="333333"/>
+                <w:sz w:val="18"/>
               </w:rPr>
               <w:t>RAG matrix table: all 50 schools, sortable by any column</w:t>
             </w:r>
@@ -1705,10 +2023,12 @@
             <w:tcW w:type="dxa" w:w="1008"/>
           </w:tcPr>
           <w:p>
+            <w:r/>
             <w:r>
               <w:rPr>
-                <w:color w:val="425466"/>
-                <w:sz w:val="19"/>
+                <w:rFonts w:ascii="Calibri" w:hAnsi="Calibri"/>
+                <w:color w:val="333333"/>
+                <w:sz w:val="18"/>
               </w:rPr>
               <w:t>FR-11</w:t>
             </w:r>
@@ -1716,13 +2036,15 @@
         </w:tc>
         <w:tc>
           <w:tcPr>
-            <w:tcW w:type="dxa" w:w="8640"/>
+            <w:tcW w:type="dxa" w:w="8352"/>
           </w:tcPr>
           <w:p>
+            <w:r/>
             <w:r>
               <w:rPr>
-                <w:color w:val="425466"/>
-                <w:sz w:val="19"/>
+                <w:rFonts w:ascii="Calibri" w:hAnsi="Calibri"/>
+                <w:color w:val="333333"/>
+                <w:sz w:val="18"/>
               </w:rPr>
               <w:t>School detail drawer: scores, exposure, explainability — opens over any view</w:t>
             </w:r>
@@ -1733,12 +2055,15 @@
         <w:tc>
           <w:tcPr>
             <w:tcW w:type="dxa" w:w="1008"/>
+            <w:shd w:fill="F2F2F2" w:val="clear"/>
           </w:tcPr>
           <w:p>
+            <w:r/>
             <w:r>
               <w:rPr>
-                <w:color w:val="425466"/>
-                <w:sz w:val="19"/>
+                <w:rFonts w:ascii="Calibri" w:hAnsi="Calibri"/>
+                <w:color w:val="333333"/>
+                <w:sz w:val="18"/>
               </w:rPr>
               <w:t>FR-12</w:t>
             </w:r>
@@ -1746,13 +2071,16 @@
         </w:tc>
         <w:tc>
           <w:tcPr>
-            <w:tcW w:type="dxa" w:w="8640"/>
+            <w:tcW w:type="dxa" w:w="8352"/>
+            <w:shd w:fill="F2F2F2" w:val="clear"/>
           </w:tcPr>
           <w:p>
+            <w:r/>
             <w:r>
               <w:rPr>
-                <w:color w:val="425466"/>
-                <w:sz w:val="19"/>
+                <w:rFonts w:ascii="Calibri" w:hAnsi="Calibri"/>
+                <w:color w:val="333333"/>
+                <w:sz w:val="18"/>
               </w:rPr>
               <w:t>Public download of dataset (.zip) and per-table parquet/csv</w:t>
             </w:r>
@@ -1765,10 +2093,12 @@
             <w:tcW w:type="dxa" w:w="1008"/>
           </w:tcPr>
           <w:p>
+            <w:r/>
             <w:r>
               <w:rPr>
-                <w:color w:val="425466"/>
-                <w:sz w:val="19"/>
+                <w:rFonts w:ascii="Calibri" w:hAnsi="Calibri"/>
+                <w:color w:val="333333"/>
+                <w:sz w:val="18"/>
               </w:rPr>
               <w:t>FR-13</w:t>
             </w:r>
@@ -1776,13 +2106,15 @@
         </w:tc>
         <w:tc>
           <w:tcPr>
-            <w:tcW w:type="dxa" w:w="8640"/>
+            <w:tcW w:type="dxa" w:w="8352"/>
           </w:tcPr>
           <w:p>
+            <w:r/>
             <w:r>
               <w:rPr>
-                <w:color w:val="425466"/>
-                <w:sz w:val="19"/>
+                <w:rFonts w:ascii="Calibri" w:hAnsi="Calibri"/>
+                <w:color w:val="333333"/>
+                <w:sz w:val="18"/>
               </w:rPr>
               <w:t>Configurable hazard thresholds (red/amber per hazard)</w:t>
             </w:r>
@@ -1793,12 +2125,15 @@
         <w:tc>
           <w:tcPr>
             <w:tcW w:type="dxa" w:w="1008"/>
+            <w:shd w:fill="F2F2F2" w:val="clear"/>
           </w:tcPr>
           <w:p>
+            <w:r/>
             <w:r>
               <w:rPr>
-                <w:color w:val="425466"/>
-                <w:sz w:val="19"/>
+                <w:rFonts w:ascii="Calibri" w:hAnsi="Calibri"/>
+                <w:color w:val="333333"/>
+                <w:sz w:val="18"/>
               </w:rPr>
               <w:t>FR-14</w:t>
             </w:r>
@@ -1806,13 +2141,16 @@
         </w:tc>
         <w:tc>
           <w:tcPr>
-            <w:tcW w:type="dxa" w:w="8640"/>
+            <w:tcW w:type="dxa" w:w="8352"/>
+            <w:shd w:fill="F2F2F2" w:val="clear"/>
           </w:tcPr>
           <w:p>
+            <w:r/>
             <w:r>
               <w:rPr>
-                <w:color w:val="425466"/>
-                <w:sz w:val="19"/>
+                <w:rFonts w:ascii="Calibri" w:hAnsi="Calibri"/>
+                <w:color w:val="333333"/>
+                <w:sz w:val="18"/>
               </w:rPr>
               <w:t>Active-language toggle (EN / UR / Punjabi-Shahmukhi / Sindhi / Pashto)</w:t>
             </w:r>
@@ -1825,10 +2163,12 @@
             <w:tcW w:type="dxa" w:w="1008"/>
           </w:tcPr>
           <w:p>
+            <w:r/>
             <w:r>
               <w:rPr>
-                <w:color w:val="425466"/>
-                <w:sz w:val="19"/>
+                <w:rFonts w:ascii="Calibri" w:hAnsi="Calibri"/>
+                <w:color w:val="333333"/>
+                <w:sz w:val="18"/>
               </w:rPr>
               <w:t>FR-15</w:t>
             </w:r>
@@ -1836,13 +2176,15 @@
         </w:tc>
         <w:tc>
           <w:tcPr>
-            <w:tcW w:type="dxa" w:w="8640"/>
+            <w:tcW w:type="dxa" w:w="8352"/>
           </w:tcPr>
           <w:p>
+            <w:r/>
             <w:r>
               <w:rPr>
-                <w:color w:val="425466"/>
-                <w:sz w:val="19"/>
+                <w:rFonts w:ascii="Calibri" w:hAnsi="Calibri"/>
+                <w:color w:val="333333"/>
+                <w:sz w:val="18"/>
               </w:rPr>
               <w:t>Editable advisory templates per hazard</w:t>
             </w:r>
@@ -1853,12 +2195,15 @@
         <w:tc>
           <w:tcPr>
             <w:tcW w:type="dxa" w:w="1008"/>
+            <w:shd w:fill="F2F2F2" w:val="clear"/>
           </w:tcPr>
           <w:p>
+            <w:r/>
             <w:r>
               <w:rPr>
-                <w:color w:val="425466"/>
-                <w:sz w:val="19"/>
+                <w:rFonts w:ascii="Calibri" w:hAnsi="Calibri"/>
+                <w:color w:val="333333"/>
+                <w:sz w:val="18"/>
               </w:rPr>
               <w:t>FR-16</w:t>
             </w:r>
@@ -1866,13 +2211,16 @@
         </w:tc>
         <w:tc>
           <w:tcPr>
-            <w:tcW w:type="dxa" w:w="8640"/>
+            <w:tcW w:type="dxa" w:w="8352"/>
+            <w:shd w:fill="F2F2F2" w:val="clear"/>
           </w:tcPr>
           <w:p>
+            <w:r/>
             <w:r>
               <w:rPr>
-                <w:color w:val="425466"/>
-                <w:sz w:val="19"/>
+                <w:rFonts w:ascii="Calibri" w:hAnsi="Calibri"/>
+                <w:color w:val="333333"/>
+                <w:sz w:val="18"/>
               </w:rPr>
               <w:t>Chat: ⌘K + FAB; streaming responses; tool-call display; clickable citations</w:t>
             </w:r>
@@ -1885,10 +2233,12 @@
             <w:tcW w:type="dxa" w:w="1008"/>
           </w:tcPr>
           <w:p>
+            <w:r/>
             <w:r>
               <w:rPr>
-                <w:color w:val="425466"/>
-                <w:sz w:val="19"/>
+                <w:rFonts w:ascii="Calibri" w:hAnsi="Calibri"/>
+                <w:color w:val="333333"/>
+                <w:sz w:val="18"/>
               </w:rPr>
               <w:t>FR-17</w:t>
             </w:r>
@@ -1896,13 +2246,15 @@
         </w:tc>
         <w:tc>
           <w:tcPr>
-            <w:tcW w:type="dxa" w:w="8640"/>
+            <w:tcW w:type="dxa" w:w="8352"/>
           </w:tcPr>
           <w:p>
+            <w:r/>
             <w:r>
               <w:rPr>
-                <w:color w:val="425466"/>
-                <w:sz w:val="19"/>
+                <w:rFonts w:ascii="Calibri" w:hAnsi="Calibri"/>
+                <w:color w:val="333333"/>
+                <w:sz w:val="18"/>
               </w:rPr>
               <w:t>Chat: 5 capability buckets — query, decide, explain, draft, multilingual</w:t>
             </w:r>
@@ -1913,12 +2265,15 @@
         <w:tc>
           <w:tcPr>
             <w:tcW w:type="dxa" w:w="1008"/>
+            <w:shd w:fill="F2F2F2" w:val="clear"/>
           </w:tcPr>
           <w:p>
+            <w:r/>
             <w:r>
               <w:rPr>
-                <w:color w:val="425466"/>
-                <w:sz w:val="19"/>
+                <w:rFonts w:ascii="Calibri" w:hAnsi="Calibri"/>
+                <w:color w:val="333333"/>
+                <w:sz w:val="18"/>
               </w:rPr>
               <w:t>FR-18</w:t>
             </w:r>
@@ -1926,13 +2281,16 @@
         </w:tc>
         <w:tc>
           <w:tcPr>
-            <w:tcW w:type="dxa" w:w="8640"/>
+            <w:tcW w:type="dxa" w:w="8352"/>
+            <w:shd w:fill="F2F2F2" w:val="clear"/>
           </w:tcPr>
           <w:p>
+            <w:r/>
             <w:r>
               <w:rPr>
-                <w:color w:val="425466"/>
-                <w:sz w:val="19"/>
+                <w:rFonts w:ascii="Calibri" w:hAnsi="Calibri"/>
+                <w:color w:val="333333"/>
+                <w:sz w:val="18"/>
               </w:rPr>
               <w:t>Cluster-level actions on Overview: click row → filter map; envelope → broadcast advisory</w:t>
             </w:r>
@@ -1940,15 +2298,20 @@
         </w:tc>
       </w:tr>
     </w:tbl>
+    <w:p/>
     <w:p>
       <w:pPr>
-        <w:spacing w:before="280" w:after="80"/>
+        <w:spacing w:before="360" w:after="160"/>
+        <w:pBdr>
+          <w:bottom w:val="single" w:sz="4" w:space="1" w:color="003D6B"/>
+        </w:pBdr>
       </w:pPr>
       <w:r>
         <w:rPr>
+          <w:rFonts w:ascii="Calibri" w:hAnsi="Calibri"/>
           <w:b/>
-          <w:color w:val="635BFF"/>
-          <w:sz w:val="26"/>
+          <w:color w:val="003D6B"/>
+          <w:sz w:val="24"/>
         </w:rPr>
         <w:t>6. Non-functional requirements</w:t>
       </w:r>
@@ -1958,22 +2321,32 @@
         <w:tblW w:type="auto" w:w="0"/>
         <w:tblLayout w:type="fixed"/>
         <w:tblLook w:firstColumn="1" w:firstRow="1" w:lastColumn="0" w:lastRow="0" w:noHBand="0" w:noVBand="1" w:val="04A0"/>
+        <w:tblBorders>
+          <w:top w:val="single" w:sz="4" w:space="0" w:color="999999"/>
+          <w:left w:val="single" w:sz="4" w:space="0" w:color="999999"/>
+          <w:bottom w:val="single" w:sz="4" w:space="0" w:color="999999"/>
+          <w:right w:val="single" w:sz="4" w:space="0" w:color="999999"/>
+          <w:insideH w:val="single" w:sz="4" w:space="0" w:color="999999"/>
+          <w:insideV w:val="single" w:sz="4" w:space="0" w:color="999999"/>
+        </w:tblBorders>
       </w:tblPr>
       <w:tblGrid>
-        <w:gridCol w:w="4824"/>
-        <w:gridCol w:w="4824"/>
+        <w:gridCol w:w="4680"/>
+        <w:gridCol w:w="4680"/>
       </w:tblGrid>
       <w:tr>
         <w:tc>
           <w:tcPr>
             <w:tcW w:type="dxa" w:w="1008"/>
-            <w:shd w:val="clear" w:color="auto" w:fill="F0F1FF"/>
+            <w:shd w:fill="003D6B" w:val="clear"/>
           </w:tcPr>
           <w:p>
+            <w:r/>
             <w:r>
               <w:rPr>
+                <w:rFonts w:ascii="Calibri" w:hAnsi="Calibri"/>
                 <w:b/>
-                <w:color w:val="635BFF"/>
+                <w:color w:val="FFFFFF"/>
                 <w:sz w:val="18"/>
               </w:rPr>
               <w:t>#</w:t>
@@ -1982,14 +2355,16 @@
         </w:tc>
         <w:tc>
           <w:tcPr>
-            <w:tcW w:type="dxa" w:w="8640"/>
-            <w:shd w:val="clear" w:color="auto" w:fill="F0F1FF"/>
+            <w:tcW w:type="dxa" w:w="8352"/>
+            <w:shd w:fill="003D6B" w:val="clear"/>
           </w:tcPr>
           <w:p>
+            <w:r/>
             <w:r>
               <w:rPr>
+                <w:rFonts w:ascii="Calibri" w:hAnsi="Calibri"/>
                 <w:b/>
-                <w:color w:val="635BFF"/>
+                <w:color w:val="FFFFFF"/>
                 <w:sz w:val="18"/>
               </w:rPr>
               <w:t>Requirement</w:t>
@@ -2003,10 +2378,12 @@
             <w:tcW w:type="dxa" w:w="1008"/>
           </w:tcPr>
           <w:p>
+            <w:r/>
             <w:r>
               <w:rPr>
-                <w:color w:val="425466"/>
-                <w:sz w:val="19"/>
+                <w:rFonts w:ascii="Calibri" w:hAnsi="Calibri"/>
+                <w:color w:val="333333"/>
+                <w:sz w:val="18"/>
               </w:rPr>
               <w:t>NFR-1</w:t>
             </w:r>
@@ -2014,13 +2391,15 @@
         </w:tc>
         <w:tc>
           <w:tcPr>
-            <w:tcW w:type="dxa" w:w="8640"/>
+            <w:tcW w:type="dxa" w:w="8352"/>
           </w:tcPr>
           <w:p>
+            <w:r/>
             <w:r>
               <w:rPr>
-                <w:color w:val="425466"/>
-                <w:sz w:val="19"/>
+                <w:rFonts w:ascii="Calibri" w:hAnsi="Calibri"/>
+                <w:color w:val="333333"/>
+                <w:sz w:val="18"/>
               </w:rPr>
               <w:t>WCAG 2.2 AA; keyboard nav; visible focus rings on all interactive elements</w:t>
             </w:r>
@@ -2031,12 +2410,15 @@
         <w:tc>
           <w:tcPr>
             <w:tcW w:type="dxa" w:w="1008"/>
+            <w:shd w:fill="F2F2F2" w:val="clear"/>
           </w:tcPr>
           <w:p>
+            <w:r/>
             <w:r>
               <w:rPr>
-                <w:color w:val="425466"/>
-                <w:sz w:val="19"/>
+                <w:rFonts w:ascii="Calibri" w:hAnsi="Calibri"/>
+                <w:color w:val="333333"/>
+                <w:sz w:val="18"/>
               </w:rPr>
               <w:t>NFR-2</w:t>
             </w:r>
@@ -2044,13 +2426,16 @@
         </w:tc>
         <w:tc>
           <w:tcPr>
-            <w:tcW w:type="dxa" w:w="8640"/>
+            <w:tcW w:type="dxa" w:w="8352"/>
+            <w:shd w:fill="F2F2F2" w:val="clear"/>
           </w:tcPr>
           <w:p>
+            <w:r/>
             <w:r>
               <w:rPr>
-                <w:color w:val="425466"/>
-                <w:sz w:val="19"/>
+                <w:rFonts w:ascii="Calibri" w:hAnsi="Calibri"/>
+                <w:color w:val="333333"/>
+                <w:sz w:val="18"/>
               </w:rPr>
               <w:t>i18n: EN / UR / Punjabi-Shahmukhi; Intl.DateTimeFormat + Intl.NumberFormat; school names translate="no"</w:t>
             </w:r>
@@ -2063,10 +2448,12 @@
             <w:tcW w:type="dxa" w:w="1008"/>
           </w:tcPr>
           <w:p>
+            <w:r/>
             <w:r>
               <w:rPr>
-                <w:color w:val="425466"/>
-                <w:sz w:val="19"/>
+                <w:rFonts w:ascii="Calibri" w:hAnsi="Calibri"/>
+                <w:color w:val="333333"/>
+                <w:sz w:val="18"/>
               </w:rPr>
               <w:t>NFR-3</w:t>
             </w:r>
@@ -2074,13 +2461,15 @@
         </w:tc>
         <w:tc>
           <w:tcPr>
-            <w:tcW w:type="dxa" w:w="8640"/>
+            <w:tcW w:type="dxa" w:w="8352"/>
           </w:tcPr>
           <w:p>
+            <w:r/>
             <w:r>
               <w:rPr>
-                <w:color w:val="425466"/>
-                <w:sz w:val="19"/>
+                <w:rFonts w:ascii="Calibri" w:hAnsi="Calibri"/>
+                <w:color w:val="333333"/>
+                <w:sz w:val="18"/>
               </w:rPr>
               <w:t>Performance: LCP &lt; 1.5s on 3G; map renders 50 markers in single frame</w:t>
             </w:r>
@@ -2091,12 +2480,15 @@
         <w:tc>
           <w:tcPr>
             <w:tcW w:type="dxa" w:w="1008"/>
+            <w:shd w:fill="F2F2F2" w:val="clear"/>
           </w:tcPr>
           <w:p>
+            <w:r/>
             <w:r>
               <w:rPr>
-                <w:color w:val="425466"/>
-                <w:sz w:val="19"/>
+                <w:rFonts w:ascii="Calibri" w:hAnsi="Calibri"/>
+                <w:color w:val="333333"/>
+                <w:sz w:val="18"/>
               </w:rPr>
               <w:t>NFR-4</w:t>
             </w:r>
@@ -2104,13 +2496,16 @@
         </w:tc>
         <w:tc>
           <w:tcPr>
-            <w:tcW w:type="dxa" w:w="8640"/>
+            <w:tcW w:type="dxa" w:w="8352"/>
+            <w:shd w:fill="F2F2F2" w:val="clear"/>
           </w:tcPr>
           <w:p>
+            <w:r/>
             <w:r>
               <w:rPr>
-                <w:color w:val="425466"/>
-                <w:sz w:val="19"/>
+                <w:rFonts w:ascii="Calibri" w:hAnsi="Calibri"/>
+                <w:color w:val="333333"/>
+                <w:sz w:val="18"/>
               </w:rPr>
               <w:t>Theme: system default; user override persisted in localStorage</w:t>
             </w:r>
@@ -2123,10 +2518,12 @@
             <w:tcW w:type="dxa" w:w="1008"/>
           </w:tcPr>
           <w:p>
+            <w:r/>
             <w:r>
               <w:rPr>
-                <w:color w:val="425466"/>
-                <w:sz w:val="19"/>
+                <w:rFonts w:ascii="Calibri" w:hAnsi="Calibri"/>
+                <w:color w:val="333333"/>
+                <w:sz w:val="18"/>
               </w:rPr>
               <w:t>NFR-5</w:t>
             </w:r>
@@ -2134,13 +2531,15 @@
         </w:tc>
         <w:tc>
           <w:tcPr>
-            <w:tcW w:type="dxa" w:w="8640"/>
+            <w:tcW w:type="dxa" w:w="8352"/>
           </w:tcPr>
           <w:p>
+            <w:r/>
             <w:r>
               <w:rPr>
-                <w:color w:val="425466"/>
-                <w:sz w:val="19"/>
+                <w:rFonts w:ascii="Calibri" w:hAnsi="Calibri"/>
+                <w:color w:val="333333"/>
+                <w:sz w:val="18"/>
               </w:rPr>
               <w:t>Privacy: no parent PII in the hub; messaging gateway holds contacts</w:t>
             </w:r>
@@ -2151,12 +2550,15 @@
         <w:tc>
           <w:tcPr>
             <w:tcW w:type="dxa" w:w="1008"/>
+            <w:shd w:fill="F2F2F2" w:val="clear"/>
           </w:tcPr>
           <w:p>
+            <w:r/>
             <w:r>
               <w:rPr>
-                <w:color w:val="425466"/>
-                <w:sz w:val="19"/>
+                <w:rFonts w:ascii="Calibri" w:hAnsi="Calibri"/>
+                <w:color w:val="333333"/>
+                <w:sz w:val="18"/>
               </w:rPr>
               <w:t>NFR-6</w:t>
             </w:r>
@@ -2164,13 +2566,16 @@
         </w:tc>
         <w:tc>
           <w:tcPr>
-            <w:tcW w:type="dxa" w:w="8640"/>
+            <w:tcW w:type="dxa" w:w="8352"/>
+            <w:shd w:fill="F2F2F2" w:val="clear"/>
           </w:tcPr>
           <w:p>
+            <w:r/>
             <w:r>
               <w:rPr>
-                <w:color w:val="425466"/>
-                <w:sz w:val="19"/>
+                <w:rFonts w:ascii="Calibri" w:hAnsi="Calibri"/>
+                <w:color w:val="333333"/>
+                <w:sz w:val="18"/>
               </w:rPr>
               <w:t>Licensing: Apache-2.0 (code) · CC BY 4.0 (open dataset)</w:t>
             </w:r>
@@ -2183,10 +2588,12 @@
             <w:tcW w:type="dxa" w:w="1008"/>
           </w:tcPr>
           <w:p>
+            <w:r/>
             <w:r>
               <w:rPr>
-                <w:color w:val="425466"/>
-                <w:sz w:val="19"/>
+                <w:rFonts w:ascii="Calibri" w:hAnsi="Calibri"/>
+                <w:color w:val="333333"/>
+                <w:sz w:val="18"/>
               </w:rPr>
               <w:t>NFR-7</w:t>
             </w:r>
@@ -2194,13 +2601,15 @@
         </w:tc>
         <w:tc>
           <w:tcPr>
-            <w:tcW w:type="dxa" w:w="8640"/>
+            <w:tcW w:type="dxa" w:w="8352"/>
           </w:tcPr>
           <w:p>
+            <w:r/>
             <w:r>
               <w:rPr>
-                <w:color w:val="425466"/>
-                <w:sz w:val="19"/>
+                <w:rFonts w:ascii="Calibri" w:hAnsi="Calibri"/>
+                <w:color w:val="333333"/>
+                <w:sz w:val="18"/>
               </w:rPr>
               <w:t>Deployment: stateless API, static front-end, cron-driven ingest</w:t>
             </w:r>
@@ -2211,12 +2620,15 @@
         <w:tc>
           <w:tcPr>
             <w:tcW w:type="dxa" w:w="1008"/>
+            <w:shd w:fill="F2F2F2" w:val="clear"/>
           </w:tcPr>
           <w:p>
+            <w:r/>
             <w:r>
               <w:rPr>
-                <w:color w:val="425466"/>
-                <w:sz w:val="19"/>
+                <w:rFonts w:ascii="Calibri" w:hAnsi="Calibri"/>
+                <w:color w:val="333333"/>
+                <w:sz w:val="18"/>
               </w:rPr>
               <w:t>NFR-8</w:t>
             </w:r>
@@ -2224,13 +2636,16 @@
         </w:tc>
         <w:tc>
           <w:tcPr>
-            <w:tcW w:type="dxa" w:w="8640"/>
+            <w:tcW w:type="dxa" w:w="8352"/>
+            <w:shd w:fill="F2F2F2" w:val="clear"/>
           </w:tcPr>
           <w:p>
+            <w:r/>
             <w:r>
               <w:rPr>
-                <w:color w:val="425466"/>
-                <w:sz w:val="19"/>
+                <w:rFonts w:ascii="Calibri" w:hAnsi="Calibri"/>
+                <w:color w:val="333333"/>
+                <w:sz w:val="18"/>
               </w:rPr>
               <w:t>Observability: all dispatches + decisions audit-logged with operator ID</w:t>
             </w:r>
@@ -2243,10 +2658,12 @@
             <w:tcW w:type="dxa" w:w="1008"/>
           </w:tcPr>
           <w:p>
+            <w:r/>
             <w:r>
               <w:rPr>
-                <w:color w:val="425466"/>
-                <w:sz w:val="19"/>
+                <w:rFonts w:ascii="Calibri" w:hAnsi="Calibri"/>
+                <w:color w:val="333333"/>
+                <w:sz w:val="18"/>
               </w:rPr>
               <w:t>NFR-9</w:t>
             </w:r>
@@ -2254,13 +2671,15 @@
         </w:tc>
         <w:tc>
           <w:tcPr>
-            <w:tcW w:type="dxa" w:w="8640"/>
+            <w:tcW w:type="dxa" w:w="8352"/>
           </w:tcPr>
           <w:p>
+            <w:r/>
             <w:r>
               <w:rPr>
-                <w:color w:val="425466"/>
-                <w:sz w:val="19"/>
+                <w:rFonts w:ascii="Calibri" w:hAnsi="Calibri"/>
+                <w:color w:val="333333"/>
+                <w:sz w:val="18"/>
               </w:rPr>
               <w:t>Reduced-motion: animations honour prefers-reduced-motion: reduce</w:t>
             </w:r>
@@ -2268,15 +2687,20 @@
         </w:tc>
       </w:tr>
     </w:tbl>
+    <w:p/>
     <w:p>
       <w:pPr>
-        <w:spacing w:before="280" w:after="80"/>
+        <w:spacing w:before="360" w:after="160"/>
+        <w:pBdr>
+          <w:bottom w:val="single" w:sz="4" w:space="1" w:color="003D6B"/>
+        </w:pBdr>
       </w:pPr>
       <w:r>
         <w:rPr>
+          <w:rFonts w:ascii="Calibri" w:hAnsi="Calibri"/>
           <w:b/>
-          <w:color w:val="635BFF"/>
-          <w:sz w:val="26"/>
+          <w:color w:val="003D6B"/>
+          <w:sz w:val="24"/>
         </w:rPr>
         <w:t>7. Out of scope (v0.1)</w:t>
       </w:r>
@@ -2284,11 +2708,12 @@
     <w:p>
       <w:pPr>
         <w:pStyle w:val="ListBullet"/>
-        <w:spacing w:after="40"/>
+        <w:spacing w:after="60"/>
       </w:pPr>
       <w:r>
         <w:rPr>
-          <w:color w:val="425466"/>
+          <w:rFonts w:ascii="Calibri" w:hAnsi="Calibri"/>
+          <w:color w:val="333333"/>
           <w:sz w:val="20"/>
         </w:rPr>
         <w:t>Climate–attendance ML model — needs PEF SIS attendance history; deferred to Phase 1 grant deliverable</w:t>
@@ -2297,11 +2722,12 @@
     <w:p>
       <w:pPr>
         <w:pStyle w:val="ListBullet"/>
-        <w:spacing w:after="40"/>
+        <w:spacing w:after="60"/>
       </w:pPr>
       <w:r>
         <w:rPr>
-          <w:color w:val="425466"/>
+          <w:rFonts w:ascii="Calibri" w:hAnsi="Calibri"/>
+          <w:color w:val="333333"/>
           <w:sz w:val="20"/>
         </w:rPr>
         <w:t>Live LLM-backed chat — submission ships scripted demos; real Claude tool-use built post-funding</w:t>
@@ -2310,11 +2736,12 @@
     <w:p>
       <w:pPr>
         <w:pStyle w:val="ListBullet"/>
-        <w:spacing w:after="40"/>
+        <w:spacing w:after="60"/>
       </w:pPr>
       <w:r>
         <w:rPr>
-          <w:color w:val="425466"/>
+          <w:rFonts w:ascii="Calibri" w:hAnsi="Calibri"/>
+          <w:color w:val="333333"/>
           <w:sz w:val="20"/>
         </w:rPr>
         <w:t>Real SMS/WhatsApp dispatch — gateway stubbed; integrated in Phase 1</w:t>
@@ -2323,11 +2750,12 @@
     <w:p>
       <w:pPr>
         <w:pStyle w:val="ListBullet"/>
-        <w:spacing w:after="40"/>
+        <w:spacing w:after="60"/>
       </w:pPr>
       <w:r>
         <w:rPr>
-          <w:color w:val="425466"/>
+          <w:rFonts w:ascii="Calibri" w:hAnsi="Calibri"/>
+          <w:color w:val="333333"/>
           <w:sz w:val="20"/>
         </w:rPr>
         <w:t>Sindh / KPK expansion — pending PDLC data</w:t>
@@ -2336,11 +2764,12 @@
     <w:p>
       <w:pPr>
         <w:pStyle w:val="ListBullet"/>
-        <w:spacing w:after="40"/>
+        <w:spacing w:after="60"/>
       </w:pPr>
       <w:r>
         <w:rPr>
-          <w:color w:val="425466"/>
+          <w:rFonts w:ascii="Calibri" w:hAnsi="Calibri"/>
+          <w:color w:val="333333"/>
           <w:sz w:val="20"/>
         </w:rPr>
         <w:t>IoT classroom sensors — procurement risk; satellite + reanalysis is enough for v0.1</w:t>
@@ -2349,11 +2778,12 @@
     <w:p>
       <w:pPr>
         <w:pStyle w:val="ListBullet"/>
-        <w:spacing w:after="40"/>
+        <w:spacing w:after="60"/>
       </w:pPr>
       <w:r>
         <w:rPr>
-          <w:color w:val="425466"/>
+          <w:rFonts w:ascii="Calibri" w:hAnsi="Calibri"/>
+          <w:color w:val="333333"/>
           <w:sz w:val="20"/>
         </w:rPr>
         <w:t>Autonomous school closure — system never closes a school; that is a government call</w:t>
@@ -2361,13 +2791,17 @@
     </w:p>
     <w:p>
       <w:pPr>
-        <w:spacing w:before="280" w:after="80"/>
+        <w:spacing w:before="360" w:after="160"/>
+        <w:pBdr>
+          <w:bottom w:val="single" w:sz="4" w:space="1" w:color="003D6B"/>
+        </w:pBdr>
       </w:pPr>
       <w:r>
         <w:rPr>
+          <w:rFonts w:ascii="Calibri" w:hAnsi="Calibri"/>
           <w:b/>
-          <w:color w:val="635BFF"/>
-          <w:sz w:val="26"/>
+          <w:color w:val="003D6B"/>
+          <w:sz w:val="24"/>
         </w:rPr>
         <w:t>8. Open questions / pending decisions</w:t>
       </w:r>
@@ -2377,24 +2811,34 @@
         <w:tblW w:type="auto" w:w="0"/>
         <w:tblLayout w:type="fixed"/>
         <w:tblLook w:firstColumn="1" w:firstRow="1" w:lastColumn="0" w:lastRow="0" w:noHBand="0" w:noVBand="1" w:val="04A0"/>
+        <w:tblBorders>
+          <w:top w:val="single" w:sz="4" w:space="0" w:color="999999"/>
+          <w:left w:val="single" w:sz="4" w:space="0" w:color="999999"/>
+          <w:bottom w:val="single" w:sz="4" w:space="0" w:color="999999"/>
+          <w:right w:val="single" w:sz="4" w:space="0" w:color="999999"/>
+          <w:insideH w:val="single" w:sz="4" w:space="0" w:color="999999"/>
+          <w:insideV w:val="single" w:sz="4" w:space="0" w:color="999999"/>
+        </w:tblBorders>
       </w:tblPr>
       <w:tblGrid>
-        <w:gridCol w:w="2412"/>
-        <w:gridCol w:w="2412"/>
-        <w:gridCol w:w="2412"/>
-        <w:gridCol w:w="2412"/>
+        <w:gridCol w:w="2340"/>
+        <w:gridCol w:w="2340"/>
+        <w:gridCol w:w="2340"/>
+        <w:gridCol w:w="2340"/>
       </w:tblGrid>
       <w:tr>
         <w:tc>
           <w:tcPr>
             <w:tcW w:type="dxa" w:w="720"/>
-            <w:shd w:val="clear" w:color="auto" w:fill="F0F1FF"/>
+            <w:shd w:fill="003D6B" w:val="clear"/>
           </w:tcPr>
           <w:p>
+            <w:r/>
             <w:r>
               <w:rPr>
+                <w:rFonts w:ascii="Calibri" w:hAnsi="Calibri"/>
                 <w:b/>
-                <w:color w:val="635BFF"/>
+                <w:color w:val="FFFFFF"/>
                 <w:sz w:val="18"/>
               </w:rPr>
               <w:t>#</w:t>
@@ -2403,14 +2847,16 @@
         </w:tc>
         <w:tc>
           <w:tcPr>
-            <w:tcW w:type="dxa" w:w="5328"/>
-            <w:shd w:val="clear" w:color="auto" w:fill="F0F1FF"/>
+            <w:tcW w:type="dxa" w:w="5040"/>
+            <w:shd w:fill="003D6B" w:val="clear"/>
           </w:tcPr>
           <w:p>
+            <w:r/>
             <w:r>
               <w:rPr>
+                <w:rFonts w:ascii="Calibri" w:hAnsi="Calibri"/>
                 <w:b/>
-                <w:color w:val="635BFF"/>
+                <w:color w:val="FFFFFF"/>
                 <w:sz w:val="18"/>
               </w:rPr>
               <w:t>Question</w:t>
@@ -2420,13 +2866,15 @@
         <w:tc>
           <w:tcPr>
             <w:tcW w:type="dxa" w:w="2016"/>
-            <w:shd w:val="clear" w:color="auto" w:fill="F0F1FF"/>
+            <w:shd w:fill="003D6B" w:val="clear"/>
           </w:tcPr>
           <w:p>
+            <w:r/>
             <w:r>
               <w:rPr>
+                <w:rFonts w:ascii="Calibri" w:hAnsi="Calibri"/>
                 <w:b/>
-                <w:color w:val="635BFF"/>
+                <w:color w:val="FFFFFF"/>
                 <w:sz w:val="18"/>
               </w:rPr>
               <w:t>Owner</w:t>
@@ -2436,13 +2884,15 @@
         <w:tc>
           <w:tcPr>
             <w:tcW w:type="dxa" w:w="1584"/>
-            <w:shd w:val="clear" w:color="auto" w:fill="F0F1FF"/>
+            <w:shd w:fill="003D6B" w:val="clear"/>
           </w:tcPr>
           <w:p>
+            <w:r/>
             <w:r>
               <w:rPr>
+                <w:rFonts w:ascii="Calibri" w:hAnsi="Calibri"/>
                 <w:b/>
-                <w:color w:val="635BFF"/>
+                <w:color w:val="FFFFFF"/>
                 <w:sz w:val="18"/>
               </w:rPr>
               <w:t>Needed by</w:t>
@@ -2456,10 +2906,12 @@
             <w:tcW w:type="dxa" w:w="720"/>
           </w:tcPr>
           <w:p>
+            <w:r/>
             <w:r>
               <w:rPr>
-                <w:color w:val="425466"/>
-                <w:sz w:val="19"/>
+                <w:rFonts w:ascii="Calibri" w:hAnsi="Calibri"/>
+                <w:color w:val="333333"/>
+                <w:sz w:val="18"/>
               </w:rPr>
               <w:t>Q1</w:t>
             </w:r>
@@ -2467,13 +2919,15 @@
         </w:tc>
         <w:tc>
           <w:tcPr>
-            <w:tcW w:type="dxa" w:w="5328"/>
+            <w:tcW w:type="dxa" w:w="5040"/>
           </w:tcPr>
           <w:p>
+            <w:r/>
             <w:r>
               <w:rPr>
-                <w:color w:val="425466"/>
-                <w:sz w:val="19"/>
+                <w:rFonts w:ascii="Calibri" w:hAnsi="Calibri"/>
+                <w:color w:val="333333"/>
+                <w:sz w:val="18"/>
               </w:rPr>
               <w:t>Punjabi-Shahmukhi advisory text — needs native-speaker review</w:t>
             </w:r>
@@ -2484,10 +2938,12 @@
             <w:tcW w:type="dxa" w:w="2016"/>
           </w:tcPr>
           <w:p>
+            <w:r/>
             <w:r>
               <w:rPr>
-                <w:color w:val="425466"/>
-                <w:sz w:val="19"/>
+                <w:rFonts w:ascii="Calibri" w:hAnsi="Calibri"/>
+                <w:color w:val="333333"/>
+                <w:sz w:val="18"/>
               </w:rPr>
               <w:t>PDLC</w:t>
             </w:r>
@@ -2498,10 +2954,218 @@
             <w:tcW w:type="dxa" w:w="1584"/>
           </w:tcPr>
           <w:p>
+            <w:r/>
             <w:r>
               <w:rPr>
-                <w:color w:val="425466"/>
-                <w:sz w:val="19"/>
+                <w:rFonts w:ascii="Calibri" w:hAnsi="Calibri"/>
+                <w:color w:val="333333"/>
+                <w:sz w:val="18"/>
+              </w:rPr>
+              <w:t>2026-05-15</w:t>
+            </w:r>
+          </w:p>
+        </w:tc>
+      </w:tr>
+      <w:tr>
+        <w:tc>
+          <w:tcPr>
+            <w:tcW w:type="dxa" w:w="720"/>
+            <w:shd w:fill="F2F2F2" w:val="clear"/>
+          </w:tcPr>
+          <w:p>
+            <w:r/>
+            <w:r>
+              <w:rPr>
+                <w:rFonts w:ascii="Calibri" w:hAnsi="Calibri"/>
+                <w:color w:val="333333"/>
+                <w:sz w:val="18"/>
+              </w:rPr>
+              <w:t>Q2</w:t>
+            </w:r>
+          </w:p>
+        </w:tc>
+        <w:tc>
+          <w:tcPr>
+            <w:tcW w:type="dxa" w:w="5040"/>
+            <w:shd w:fill="F2F2F2" w:val="clear"/>
+          </w:tcPr>
+          <w:p>
+            <w:r/>
+            <w:r>
+              <w:rPr>
+                <w:rFonts w:ascii="Calibri" w:hAnsi="Calibri"/>
+                <w:color w:val="333333"/>
+                <w:sz w:val="18"/>
+              </w:rPr>
+              <w:t>Is the 50-school footprint final, or are Sindh/KPK files coming?</w:t>
+            </w:r>
+          </w:p>
+        </w:tc>
+        <w:tc>
+          <w:tcPr>
+            <w:tcW w:type="dxa" w:w="2016"/>
+            <w:shd w:fill="F2F2F2" w:val="clear"/>
+          </w:tcPr>
+          <w:p>
+            <w:r/>
+            <w:r>
+              <w:rPr>
+                <w:rFonts w:ascii="Calibri" w:hAnsi="Calibri"/>
+                <w:color w:val="333333"/>
+                <w:sz w:val="18"/>
+              </w:rPr>
+              <w:t>Zeeshan (PDLC)</w:t>
+            </w:r>
+          </w:p>
+        </w:tc>
+        <w:tc>
+          <w:tcPr>
+            <w:tcW w:type="dxa" w:w="1584"/>
+            <w:shd w:fill="F2F2F2" w:val="clear"/>
+          </w:tcPr>
+          <w:p>
+            <w:r/>
+            <w:r>
+              <w:rPr>
+                <w:rFonts w:ascii="Calibri" w:hAnsi="Calibri"/>
+                <w:color w:val="333333"/>
+                <w:sz w:val="18"/>
+              </w:rPr>
+              <w:t>2026-05-14</w:t>
+            </w:r>
+          </w:p>
+        </w:tc>
+      </w:tr>
+      <w:tr>
+        <w:tc>
+          <w:tcPr>
+            <w:tcW w:type="dxa" w:w="720"/>
+          </w:tcPr>
+          <w:p>
+            <w:r/>
+            <w:r>
+              <w:rPr>
+                <w:rFonts w:ascii="Calibri" w:hAnsi="Calibri"/>
+                <w:color w:val="333333"/>
+                <w:sz w:val="18"/>
+              </w:rPr>
+              <w:t>Q3</w:t>
+            </w:r>
+          </w:p>
+        </w:tc>
+        <w:tc>
+          <w:tcPr>
+            <w:tcW w:type="dxa" w:w="5040"/>
+          </w:tcPr>
+          <w:p>
+            <w:r/>
+            <w:r>
+              <w:rPr>
+                <w:rFonts w:ascii="Calibri" w:hAnsi="Calibri"/>
+                <w:color w:val="333333"/>
+                <w:sz w:val="18"/>
+              </w:rPr>
+              <w:t>Will PEF attendance history be shared, or is the ML module deferred?</w:t>
+            </w:r>
+          </w:p>
+        </w:tc>
+        <w:tc>
+          <w:tcPr>
+            <w:tcW w:type="dxa" w:w="2016"/>
+          </w:tcPr>
+          <w:p>
+            <w:r/>
+            <w:r>
+              <w:rPr>
+                <w:rFonts w:ascii="Calibri" w:hAnsi="Calibri"/>
+                <w:color w:val="333333"/>
+                <w:sz w:val="18"/>
+              </w:rPr>
+              <w:t>Zeeshan (PDLC)</w:t>
+            </w:r>
+          </w:p>
+        </w:tc>
+        <w:tc>
+          <w:tcPr>
+            <w:tcW w:type="dxa" w:w="1584"/>
+          </w:tcPr>
+          <w:p>
+            <w:r/>
+            <w:r>
+              <w:rPr>
+                <w:rFonts w:ascii="Calibri" w:hAnsi="Calibri"/>
+                <w:color w:val="333333"/>
+                <w:sz w:val="18"/>
+              </w:rPr>
+              <w:t>2026-05-14</w:t>
+            </w:r>
+          </w:p>
+        </w:tc>
+      </w:tr>
+      <w:tr>
+        <w:tc>
+          <w:tcPr>
+            <w:tcW w:type="dxa" w:w="720"/>
+            <w:shd w:fill="F2F2F2" w:val="clear"/>
+          </w:tcPr>
+          <w:p>
+            <w:r/>
+            <w:r>
+              <w:rPr>
+                <w:rFonts w:ascii="Calibri" w:hAnsi="Calibri"/>
+                <w:color w:val="333333"/>
+                <w:sz w:val="18"/>
+              </w:rPr>
+              <w:t>Q4</w:t>
+            </w:r>
+          </w:p>
+        </w:tc>
+        <w:tc>
+          <w:tcPr>
+            <w:tcW w:type="dxa" w:w="5040"/>
+            <w:shd w:fill="F2F2F2" w:val="clear"/>
+          </w:tcPr>
+          <w:p>
+            <w:r/>
+            <w:r>
+              <w:rPr>
+                <w:rFonts w:ascii="Calibri" w:hAnsi="Calibri"/>
+                <w:color w:val="333333"/>
+                <w:sz w:val="18"/>
+              </w:rPr>
+              <w:t>Green School Sindh methodology document for narrative continuity</w:t>
+            </w:r>
+          </w:p>
+        </w:tc>
+        <w:tc>
+          <w:tcPr>
+            <w:tcW w:type="dxa" w:w="2016"/>
+            <w:shd w:fill="F2F2F2" w:val="clear"/>
+          </w:tcPr>
+          <w:p>
+            <w:r/>
+            <w:r>
+              <w:rPr>
+                <w:rFonts w:ascii="Calibri" w:hAnsi="Calibri"/>
+                <w:color w:val="333333"/>
+                <w:sz w:val="18"/>
+              </w:rPr>
+              <w:t>Zeeshan (PDLC)</w:t>
+            </w:r>
+          </w:p>
+        </w:tc>
+        <w:tc>
+          <w:tcPr>
+            <w:tcW w:type="dxa" w:w="1584"/>
+            <w:shd w:fill="F2F2F2" w:val="clear"/>
+          </w:tcPr>
+          <w:p>
+            <w:r/>
+            <w:r>
+              <w:rPr>
+                <w:rFonts w:ascii="Calibri" w:hAnsi="Calibri"/>
+                <w:color w:val="333333"/>
+                <w:sz w:val="18"/>
               </w:rPr>
               <w:t>2026-05-15</w:t>
             </w:r>
@@ -2514,26 +3178,30 @@
             <w:tcW w:type="dxa" w:w="720"/>
           </w:tcPr>
           <w:p>
+            <w:r/>
             <w:r>
               <w:rPr>
-                <w:color w:val="425466"/>
-                <w:sz w:val="19"/>
+                <w:rFonts w:ascii="Calibri" w:hAnsi="Calibri"/>
+                <w:color w:val="333333"/>
+                <w:sz w:val="18"/>
               </w:rPr>
-              <w:t>Q2</w:t>
+              <w:t>Q5</w:t>
             </w:r>
           </w:p>
         </w:tc>
         <w:tc>
           <w:tcPr>
-            <w:tcW w:type="dxa" w:w="5328"/>
+            <w:tcW w:type="dxa" w:w="5040"/>
           </w:tcPr>
           <w:p>
+            <w:r/>
             <w:r>
               <w:rPr>
-                <w:color w:val="425466"/>
-                <w:sz w:val="19"/>
+                <w:rFonts w:ascii="Calibri" w:hAnsi="Calibri"/>
+                <w:color w:val="333333"/>
+                <w:sz w:val="18"/>
               </w:rPr>
-              <w:t>Is the 50-school footprint final, or are Sindh/KPK files coming?</w:t>
+              <w:t>Demo video target length and key beats</w:t>
             </w:r>
           </w:p>
         </w:tc>
@@ -2542,12 +3210,14 @@
             <w:tcW w:type="dxa" w:w="2016"/>
           </w:tcPr>
           <w:p>
+            <w:r/>
             <w:r>
               <w:rPr>
-                <w:color w:val="425466"/>
-                <w:sz w:val="19"/>
+                <w:rFonts w:ascii="Calibri" w:hAnsi="Calibri"/>
+                <w:color w:val="333333"/>
+                <w:sz w:val="18"/>
               </w:rPr>
-              <w:t>Zeeshan (PDLC)</w:t>
+              <w:t>Reza (BT)</w:t>
             </w:r>
           </w:p>
         </w:tc>
@@ -2556,126 +3226,12 @@
             <w:tcW w:type="dxa" w:w="1584"/>
           </w:tcPr>
           <w:p>
+            <w:r/>
             <w:r>
               <w:rPr>
-                <w:color w:val="425466"/>
-                <w:sz w:val="19"/>
-              </w:rPr>
-              <w:t>2026-05-14</w:t>
-            </w:r>
-          </w:p>
-        </w:tc>
-      </w:tr>
-      <w:tr>
-        <w:tc>
-          <w:tcPr>
-            <w:tcW w:type="dxa" w:w="720"/>
-          </w:tcPr>
-          <w:p>
-            <w:r>
-              <w:rPr>
-                <w:color w:val="425466"/>
-                <w:sz w:val="19"/>
-              </w:rPr>
-              <w:t>Q3</w:t>
-            </w:r>
-          </w:p>
-        </w:tc>
-        <w:tc>
-          <w:tcPr>
-            <w:tcW w:type="dxa" w:w="5328"/>
-          </w:tcPr>
-          <w:p>
-            <w:r>
-              <w:rPr>
-                <w:color w:val="425466"/>
-                <w:sz w:val="19"/>
-              </w:rPr>
-              <w:t>Will PEF attendance history be shared, or is the ML module deferred?</w:t>
-            </w:r>
-          </w:p>
-        </w:tc>
-        <w:tc>
-          <w:tcPr>
-            <w:tcW w:type="dxa" w:w="2016"/>
-          </w:tcPr>
-          <w:p>
-            <w:r>
-              <w:rPr>
-                <w:color w:val="425466"/>
-                <w:sz w:val="19"/>
-              </w:rPr>
-              <w:t>Zeeshan (PDLC)</w:t>
-            </w:r>
-          </w:p>
-        </w:tc>
-        <w:tc>
-          <w:tcPr>
-            <w:tcW w:type="dxa" w:w="1584"/>
-          </w:tcPr>
-          <w:p>
-            <w:r>
-              <w:rPr>
-                <w:color w:val="425466"/>
-                <w:sz w:val="19"/>
-              </w:rPr>
-              <w:t>2026-05-14</w:t>
-            </w:r>
-          </w:p>
-        </w:tc>
-      </w:tr>
-      <w:tr>
-        <w:tc>
-          <w:tcPr>
-            <w:tcW w:type="dxa" w:w="720"/>
-          </w:tcPr>
-          <w:p>
-            <w:r>
-              <w:rPr>
-                <w:color w:val="425466"/>
-                <w:sz w:val="19"/>
-              </w:rPr>
-              <w:t>Q4</w:t>
-            </w:r>
-          </w:p>
-        </w:tc>
-        <w:tc>
-          <w:tcPr>
-            <w:tcW w:type="dxa" w:w="5328"/>
-          </w:tcPr>
-          <w:p>
-            <w:r>
-              <w:rPr>
-                <w:color w:val="425466"/>
-                <w:sz w:val="19"/>
-              </w:rPr>
-              <w:t>Green School Sindh methodology document for narrative continuity</w:t>
-            </w:r>
-          </w:p>
-        </w:tc>
-        <w:tc>
-          <w:tcPr>
-            <w:tcW w:type="dxa" w:w="2016"/>
-          </w:tcPr>
-          <w:p>
-            <w:r>
-              <w:rPr>
-                <w:color w:val="425466"/>
-                <w:sz w:val="19"/>
-              </w:rPr>
-              <w:t>Zeeshan (PDLC)</w:t>
-            </w:r>
-          </w:p>
-        </w:tc>
-        <w:tc>
-          <w:tcPr>
-            <w:tcW w:type="dxa" w:w="1584"/>
-          </w:tcPr>
-          <w:p>
-            <w:r>
-              <w:rPr>
-                <w:color w:val="425466"/>
-                <w:sz w:val="19"/>
+                <w:rFonts w:ascii="Calibri" w:hAnsi="Calibri"/>
+                <w:color w:val="333333"/>
+                <w:sz w:val="18"/>
               </w:rPr>
               <w:t>2026-05-15</w:t>
             </w:r>
@@ -2686,70 +3242,15 @@
         <w:tc>
           <w:tcPr>
             <w:tcW w:type="dxa" w:w="720"/>
+            <w:shd w:fill="F2F2F2" w:val="clear"/>
           </w:tcPr>
           <w:p>
+            <w:r/>
             <w:r>
               <w:rPr>
-                <w:color w:val="425466"/>
-                <w:sz w:val="19"/>
-              </w:rPr>
-              <w:t>Q5</w:t>
-            </w:r>
-          </w:p>
-        </w:tc>
-        <w:tc>
-          <w:tcPr>
-            <w:tcW w:type="dxa" w:w="5328"/>
-          </w:tcPr>
-          <w:p>
-            <w:r>
-              <w:rPr>
-                <w:color w:val="425466"/>
-                <w:sz w:val="19"/>
-              </w:rPr>
-              <w:t>Demo video target length and key beats</w:t>
-            </w:r>
-          </w:p>
-        </w:tc>
-        <w:tc>
-          <w:tcPr>
-            <w:tcW w:type="dxa" w:w="2016"/>
-          </w:tcPr>
-          <w:p>
-            <w:r>
-              <w:rPr>
-                <w:color w:val="425466"/>
-                <w:sz w:val="19"/>
-              </w:rPr>
-              <w:t>Reza (BT)</w:t>
-            </w:r>
-          </w:p>
-        </w:tc>
-        <w:tc>
-          <w:tcPr>
-            <w:tcW w:type="dxa" w:w="1584"/>
-          </w:tcPr>
-          <w:p>
-            <w:r>
-              <w:rPr>
-                <w:color w:val="425466"/>
-                <w:sz w:val="19"/>
-              </w:rPr>
-              <w:t>2026-05-15</w:t>
-            </w:r>
-          </w:p>
-        </w:tc>
-      </w:tr>
-      <w:tr>
-        <w:tc>
-          <w:tcPr>
-            <w:tcW w:type="dxa" w:w="720"/>
-          </w:tcPr>
-          <w:p>
-            <w:r>
-              <w:rPr>
-                <w:color w:val="425466"/>
-                <w:sz w:val="19"/>
+                <w:rFonts w:ascii="Calibri" w:hAnsi="Calibri"/>
+                <w:color w:val="333333"/>
+                <w:sz w:val="18"/>
               </w:rPr>
               <w:t>Q6</w:t>
             </w:r>
@@ -2757,13 +3258,16 @@
         </w:tc>
         <w:tc>
           <w:tcPr>
-            <w:tcW w:type="dxa" w:w="5328"/>
+            <w:tcW w:type="dxa" w:w="5040"/>
+            <w:shd w:fill="F2F2F2" w:val="clear"/>
           </w:tcPr>
           <w:p>
+            <w:r/>
             <w:r>
               <w:rPr>
-                <w:color w:val="425466"/>
-                <w:sz w:val="19"/>
+                <w:rFonts w:ascii="Calibri" w:hAnsi="Calibri"/>
+                <w:color w:val="333333"/>
+                <w:sz w:val="18"/>
               </w:rPr>
               <w:t>Submission package PDF — who signs the cover letter?</w:t>
             </w:r>
@@ -2772,12 +3276,15 @@
         <w:tc>
           <w:tcPr>
             <w:tcW w:type="dxa" w:w="2016"/>
+            <w:shd w:fill="F2F2F2" w:val="clear"/>
           </w:tcPr>
           <w:p>
+            <w:r/>
             <w:r>
               <w:rPr>
-                <w:color w:val="425466"/>
-                <w:sz w:val="19"/>
+                <w:rFonts w:ascii="Calibri" w:hAnsi="Calibri"/>
+                <w:color w:val="333333"/>
+                <w:sz w:val="18"/>
               </w:rPr>
               <w:t>Erum (PDLC)</w:t>
             </w:r>
@@ -2786,12 +3293,15 @@
         <w:tc>
           <w:tcPr>
             <w:tcW w:type="dxa" w:w="1584"/>
+            <w:shd w:fill="F2F2F2" w:val="clear"/>
           </w:tcPr>
           <w:p>
+            <w:r/>
             <w:r>
               <w:rPr>
-                <w:color w:val="425466"/>
-                <w:sz w:val="19"/>
+                <w:rFonts w:ascii="Calibri" w:hAnsi="Calibri"/>
+                <w:color w:val="333333"/>
+                <w:sz w:val="18"/>
               </w:rPr>
               <w:t>2026-05-16</w:t>
             </w:r>
@@ -2799,15 +3309,20 @@
         </w:tc>
       </w:tr>
     </w:tbl>
+    <w:p/>
     <w:p>
       <w:pPr>
-        <w:spacing w:before="280" w:after="80"/>
+        <w:spacing w:before="360" w:after="160"/>
+        <w:pBdr>
+          <w:bottom w:val="single" w:sz="4" w:space="1" w:color="003D6B"/>
+        </w:pBdr>
       </w:pPr>
       <w:r>
         <w:rPr>
+          <w:rFonts w:ascii="Calibri" w:hAnsi="Calibri"/>
           <w:b/>
-          <w:color w:val="635BFF"/>
-          <w:sz w:val="26"/>
+          <w:color w:val="003D6B"/>
+          <w:sz w:val="24"/>
         </w:rPr>
         <w:t>9. Success criteria</w:t>
       </w:r>
@@ -2815,11 +3330,12 @@
     <w:p>
       <w:pPr>
         <w:pStyle w:val="ListBullet"/>
-        <w:spacing w:after="40"/>
+        <w:spacing w:after="60"/>
       </w:pPr>
       <w:r>
         <w:rPr>
-          <w:color w:val="425466"/>
+          <w:rFonts w:ascii="Calibri" w:hAnsi="Calibri"/>
+          <w:color w:val="333333"/>
           <w:sz w:val="20"/>
         </w:rPr>
         <w:t>Submission filed by 2026-05-17 by PDLC</w:t>
@@ -2828,11 +3344,12 @@
     <w:p>
       <w:pPr>
         <w:pStyle w:val="ListBullet"/>
-        <w:spacing w:after="40"/>
+        <w:spacing w:after="60"/>
       </w:pPr>
       <w:r>
         <w:rPr>
-          <w:color w:val="425466"/>
+          <w:rFonts w:ascii="Calibri" w:hAnsi="Calibri"/>
+          <w:color w:val="333333"/>
           <w:sz w:val="20"/>
         </w:rPr>
         <w:t>Public demo URL live by 2026-05-16</w:t>
@@ -2841,11 +3358,12 @@
     <w:p>
       <w:pPr>
         <w:pStyle w:val="ListBullet"/>
-        <w:spacing w:after="40"/>
+        <w:spacing w:after="60"/>
       </w:pPr>
       <w:r>
         <w:rPr>
-          <w:color w:val="425466"/>
+          <w:rFonts w:ascii="Calibri" w:hAnsi="Calibri"/>
+          <w:color w:val="333333"/>
           <w:sz w:val="20"/>
         </w:rPr>
         <w:t>Open dataset published to GitHub Releases (target HDX + Zenodo mirror post-submission)</w:t>
@@ -2854,11 +3372,12 @@
     <w:p>
       <w:pPr>
         <w:pStyle w:val="ListBullet"/>
-        <w:spacing w:after="40"/>
+        <w:spacing w:after="60"/>
       </w:pPr>
       <w:r>
         <w:rPr>
-          <w:color w:val="425466"/>
+          <w:rFonts w:ascii="Calibri" w:hAnsi="Calibri"/>
+          <w:color w:val="333333"/>
           <w:sz w:val="20"/>
         </w:rPr>
         <w:t>All 10 jobs-to-be-done demonstrable in the live mockup</w:t>
@@ -2867,11 +3386,12 @@
     <w:p>
       <w:pPr>
         <w:pStyle w:val="ListBullet"/>
-        <w:spacing w:after="40"/>
+        <w:spacing w:after="60"/>
       </w:pPr>
       <w:r>
         <w:rPr>
-          <w:color w:val="425466"/>
+          <w:rFonts w:ascii="Calibri" w:hAnsi="Calibri"/>
+          <w:color w:val="333333"/>
           <w:sz w:val="20"/>
         </w:rPr>
         <w:t>PDLC sign-off on the operator workflow + advisory text</w:t>
@@ -2880,11 +3400,12 @@
     <w:p>
       <w:pPr>
         <w:pStyle w:val="ListBullet"/>
-        <w:spacing w:after="40"/>
+        <w:spacing w:after="60"/>
       </w:pPr>
       <w:r>
         <w:rPr>
-          <w:color w:val="425466"/>
+          <w:rFonts w:ascii="Calibri" w:hAnsi="Calibri"/>
+          <w:color w:val="333333"/>
           <w:sz w:val="20"/>
         </w:rPr>
         <w:t>Repo has README, LICENSE, PRD, architecture doc, open-dataset schema</w:t>
@@ -2892,13 +3413,17 @@
     </w:p>
     <w:p>
       <w:pPr>
-        <w:spacing w:before="280" w:after="80"/>
+        <w:spacing w:before="360" w:after="160"/>
+        <w:pBdr>
+          <w:bottom w:val="single" w:sz="4" w:space="1" w:color="003D6B"/>
+        </w:pBdr>
       </w:pPr>
       <w:r>
         <w:rPr>
+          <w:rFonts w:ascii="Calibri" w:hAnsi="Calibri"/>
           <w:b/>
-          <w:color w:val="635BFF"/>
-          <w:sz w:val="26"/>
+          <w:color w:val="003D6B"/>
+          <w:sz w:val="24"/>
         </w:rPr>
         <w:t>10. Phase roadmap</w:t>
       </w:r>
@@ -2908,23 +3433,33 @@
         <w:tblW w:type="auto" w:w="0"/>
         <w:tblLayout w:type="fixed"/>
         <w:tblLook w:firstColumn="1" w:firstRow="1" w:lastColumn="0" w:lastRow="0" w:noHBand="0" w:noVBand="1" w:val="04A0"/>
+        <w:tblBorders>
+          <w:top w:val="single" w:sz="4" w:space="0" w:color="999999"/>
+          <w:left w:val="single" w:sz="4" w:space="0" w:color="999999"/>
+          <w:bottom w:val="single" w:sz="4" w:space="0" w:color="999999"/>
+          <w:right w:val="single" w:sz="4" w:space="0" w:color="999999"/>
+          <w:insideH w:val="single" w:sz="4" w:space="0" w:color="999999"/>
+          <w:insideV w:val="single" w:sz="4" w:space="0" w:color="999999"/>
+        </w:tblBorders>
       </w:tblPr>
       <w:tblGrid>
-        <w:gridCol w:w="3216"/>
-        <w:gridCol w:w="3216"/>
-        <w:gridCol w:w="3216"/>
+        <w:gridCol w:w="3120"/>
+        <w:gridCol w:w="3120"/>
+        <w:gridCol w:w="3120"/>
       </w:tblGrid>
       <w:tr>
         <w:tc>
           <w:tcPr>
-            <w:tcW w:type="dxa" w:w="2592"/>
-            <w:shd w:val="clear" w:color="auto" w:fill="F0F1FF"/>
+            <w:tcW w:type="dxa" w:w="2304"/>
+            <w:shd w:fill="003D6B" w:val="clear"/>
           </w:tcPr>
           <w:p>
+            <w:r/>
             <w:r>
               <w:rPr>
+                <w:rFonts w:ascii="Calibri" w:hAnsi="Calibri"/>
                 <w:b/>
-                <w:color w:val="635BFF"/>
+                <w:color w:val="FFFFFF"/>
                 <w:sz w:val="18"/>
               </w:rPr>
               <w:t>Phase</w:t>
@@ -2934,13 +3469,15 @@
         <w:tc>
           <w:tcPr>
             <w:tcW w:type="dxa" w:w="2880"/>
-            <w:shd w:val="clear" w:color="auto" w:fill="F0F1FF"/>
+            <w:shd w:fill="003D6B" w:val="clear"/>
           </w:tcPr>
           <w:p>
+            <w:r/>
             <w:r>
               <w:rPr>
+                <w:rFonts w:ascii="Calibri" w:hAnsi="Calibri"/>
                 <w:b/>
-                <w:color w:val="635BFF"/>
+                <w:color w:val="FFFFFF"/>
                 <w:sz w:val="18"/>
               </w:rPr>
               <w:t>Window</w:t>
@@ -2950,13 +3487,15 @@
         <w:tc>
           <w:tcPr>
             <w:tcW w:type="dxa" w:w="4176"/>
-            <w:shd w:val="clear" w:color="auto" w:fill="F0F1FF"/>
+            <w:shd w:fill="003D6B" w:val="clear"/>
           </w:tcPr>
           <w:p>
+            <w:r/>
             <w:r>
               <w:rPr>
+                <w:rFonts w:ascii="Calibri" w:hAnsi="Calibri"/>
                 <w:b/>
-                <w:color w:val="635BFF"/>
+                <w:color w:val="FFFFFF"/>
                 <w:sz w:val="18"/>
               </w:rPr>
               <w:t>Deliverables</w:t>
@@ -2967,13 +3506,15 @@
       <w:tr>
         <w:tc>
           <w:tcPr>
-            <w:tcW w:type="dxa" w:w="2592"/>
+            <w:tcW w:type="dxa" w:w="2304"/>
           </w:tcPr>
           <w:p>
+            <w:r/>
             <w:r>
               <w:rPr>
-                <w:color w:val="425466"/>
-                <w:sz w:val="19"/>
+                <w:rFonts w:ascii="Calibri" w:hAnsi="Calibri"/>
+                <w:color w:val="333333"/>
+                <w:sz w:val="18"/>
               </w:rPr>
               <w:t>v0.1 — Submission</w:t>
             </w:r>
@@ -2984,10 +3525,12 @@
             <w:tcW w:type="dxa" w:w="2880"/>
           </w:tcPr>
           <w:p>
+            <w:r/>
             <w:r>
               <w:rPr>
-                <w:color w:val="425466"/>
-                <w:sz w:val="19"/>
+                <w:rFonts w:ascii="Calibri" w:hAnsi="Calibri"/>
+                <w:color w:val="333333"/>
+                <w:sz w:val="18"/>
               </w:rPr>
               <w:t>now → 2026-05-17</w:t>
             </w:r>
@@ -2998,10 +3541,12 @@
             <w:tcW w:type="dxa" w:w="4176"/>
           </w:tcPr>
           <w:p>
+            <w:r/>
             <w:r>
               <w:rPr>
-                <w:color w:val="425466"/>
-                <w:sz w:val="19"/>
+                <w:rFonts w:ascii="Calibri" w:hAnsi="Calibri"/>
+                <w:color w:val="333333"/>
+                <w:sz w:val="18"/>
               </w:rPr>
               <w:t>Working demo, open dataset schema, this PRD, architecture doc</w:t>
             </w:r>
@@ -3011,13 +3556,16 @@
       <w:tr>
         <w:tc>
           <w:tcPr>
-            <w:tcW w:type="dxa" w:w="2592"/>
+            <w:tcW w:type="dxa" w:w="2304"/>
+            <w:shd w:fill="F2F2F2" w:val="clear"/>
           </w:tcPr>
           <w:p>
+            <w:r/>
             <w:r>
               <w:rPr>
-                <w:color w:val="425466"/>
-                <w:sz w:val="19"/>
+                <w:rFonts w:ascii="Calibri" w:hAnsi="Calibri"/>
+                <w:color w:val="333333"/>
+                <w:sz w:val="18"/>
               </w:rPr>
               <w:t>v0.2 — Grant Phase 1</w:t>
             </w:r>
@@ -3026,12 +3574,15 @@
         <w:tc>
           <w:tcPr>
             <w:tcW w:type="dxa" w:w="2880"/>
+            <w:shd w:fill="F2F2F2" w:val="clear"/>
           </w:tcPr>
           <w:p>
+            <w:r/>
             <w:r>
               <w:rPr>
-                <w:color w:val="425466"/>
-                <w:sz w:val="19"/>
+                <w:rFonts w:ascii="Calibri" w:hAnsi="Calibri"/>
+                <w:color w:val="333333"/>
+                <w:sz w:val="18"/>
               </w:rPr>
               <w:t>2026-06 → 2026-12 (if funded)</w:t>
             </w:r>
@@ -3040,12 +3591,15 @@
         <w:tc>
           <w:tcPr>
             <w:tcW w:type="dxa" w:w="4176"/>
+            <w:shd w:fill="F2F2F2" w:val="clear"/>
           </w:tcPr>
           <w:p>
+            <w:r/>
             <w:r>
               <w:rPr>
-                <w:color w:val="425466"/>
-                <w:sz w:val="19"/>
+                <w:rFonts w:ascii="Calibri" w:hAnsi="Calibri"/>
+                <w:color w:val="333333"/>
+                <w:sz w:val="18"/>
               </w:rPr>
               <w:t>Live LLM chat, real ingest pipelines daily, real SMS/WhatsApp dispatch, audit-log persistence, deployment to PDLC infrastructure</w:t>
             </w:r>
@@ -3055,13 +3609,15 @@
       <w:tr>
         <w:tc>
           <w:tcPr>
-            <w:tcW w:type="dxa" w:w="2592"/>
+            <w:tcW w:type="dxa" w:w="2304"/>
           </w:tcPr>
           <w:p>
+            <w:r/>
             <w:r>
               <w:rPr>
-                <w:color w:val="425466"/>
-                <w:sz w:val="19"/>
+                <w:rFonts w:ascii="Calibri" w:hAnsi="Calibri"/>
+                <w:color w:val="333333"/>
+                <w:sz w:val="18"/>
               </w:rPr>
               <w:t>v0.3 — Expansion</w:t>
             </w:r>
@@ -3072,10 +3628,12 @@
             <w:tcW w:type="dxa" w:w="2880"/>
           </w:tcPr>
           <w:p>
+            <w:r/>
             <w:r>
               <w:rPr>
-                <w:color w:val="425466"/>
-                <w:sz w:val="19"/>
+                <w:rFonts w:ascii="Calibri" w:hAnsi="Calibri"/>
+                <w:color w:val="333333"/>
+                <w:sz w:val="18"/>
               </w:rPr>
               <w:t>2027</w:t>
             </w:r>
@@ -3086,10 +3644,12 @@
             <w:tcW w:type="dxa" w:w="4176"/>
           </w:tcPr>
           <w:p>
+            <w:r/>
             <w:r>
               <w:rPr>
-                <w:color w:val="425466"/>
-                <w:sz w:val="19"/>
+                <w:rFonts w:ascii="Calibri" w:hAnsi="Calibri"/>
+                <w:color w:val="333333"/>
+                <w:sz w:val="18"/>
               </w:rPr>
               <w:t>Climate-attendance ML model, Sindh + KPK schools, multi-tenant operator support</w:t>
             </w:r>
@@ -3099,11 +3659,15 @@
     </w:tbl>
     <w:p/>
     <w:p>
+      <w:pPr>
+        <w:spacing w:after="120"/>
+      </w:pPr>
       <w:r>
         <w:rPr>
+          <w:rFonts w:ascii="Calibri" w:hAnsi="Calibri"/>
           <w:i/>
-          <w:color w:val="697386"/>
-          <w:sz w:val="18"/>
+          <w:color w:val="333333"/>
+          <w:sz w:val="20"/>
         </w:rPr>
         <w:t>This PRD is intentionally short. Architecture details are in docs/architecture.md. Open-dataset schema is in open_data_layer/schema.md. The live demo is at https://school-climate-hub.github.io/school-climate-hub/.</w:t>
       </w:r>
@@ -3112,7 +3676,7 @@
       <w:headerReference w:type="default" r:id="rId9"/>
       <w:footerReference w:type="default" r:id="rId10"/>
       <w:pgSz w:w="12240" w:h="15840"/>
-      <w:pgMar w:top="1440" w:right="1296" w:bottom="1152" w:left="1296" w:header="720" w:footer="720" w:gutter="0"/>
+      <w:pgMar w:top="1440" w:right="1440" w:bottom="1440" w:left="1440" w:header="720" w:footer="720" w:gutter="0"/>
       <w:cols w:space="720"/>
       <w:docGrid w:linePitch="360"/>
     </w:sectPr>
@@ -3125,11 +3689,12 @@
   <w:p>
     <w:pPr>
       <w:pStyle w:val="Footer"/>
-      <w:jc w:val="left"/>
+      <w:jc w:val="center"/>
     </w:pPr>
     <w:r>
       <w:rPr>
-        <w:color w:val="8898AA"/>
+        <w:rFonts w:ascii="Calibri" w:hAnsi="Calibri"/>
+        <w:color w:val="666666"/>
         <w:sz w:val="16"/>
       </w:rPr>
       <w:t xml:space="preserve">© 2026 Beaconhouse Technology LLC. All Rights Reserved. | CONFIDENTIAL | Page </w:t>
@@ -3148,63 +3713,44 @@
   <w:p>
     <w:pPr>
       <w:pStyle w:val="Header"/>
+      <w:spacing w:after="120"/>
+      <w:jc w:val="left"/>
     </w:pPr>
+    <w:r>
+      <w:drawing>
+        <wp:inline xmlns:a="http://schemas.openxmlformats.org/drawingml/2006/main" xmlns:pic="http://schemas.openxmlformats.org/drawingml/2006/picture">
+          <wp:extent cx="3291840" cy="439498"/>
+          <wp:docPr id="1" name="Picture 1"/>
+          <wp:cNvGraphicFramePr>
+            <a:graphicFrameLocks noChangeAspect="1"/>
+          </wp:cNvGraphicFramePr>
+          <a:graphic>
+            <a:graphicData uri="http://schemas.openxmlformats.org/drawingml/2006/picture">
+              <pic:pic>
+                <pic:nvPicPr>
+                  <pic:cNvPr id="0" name="bt-beams-logo.png"/>
+                  <pic:cNvPicPr/>
+                </pic:nvPicPr>
+                <pic:blipFill>
+                  <a:blip r:embed="rId1"/>
+                  <a:stretch>
+                    <a:fillRect/>
+                  </a:stretch>
+                </pic:blipFill>
+                <pic:spPr>
+                  <a:xfrm>
+                    <a:off x="0" y="0"/>
+                    <a:ext cx="3291840" cy="439498"/>
+                  </a:xfrm>
+                  <a:prstGeom prst="rect"/>
+                </pic:spPr>
+              </pic:pic>
+            </a:graphicData>
+          </a:graphic>
+        </wp:inline>
+      </w:drawing>
+    </w:r>
   </w:p>
-  <w:tbl>
-    <w:tblPr>
-      <w:tblW w:type="auto" w:w="0"/>
-      <w:tblLook w:firstColumn="1" w:firstRow="1" w:lastColumn="0" w:lastRow="0" w:noHBand="0" w:noVBand="1" w:val="04A0"/>
-    </w:tblPr>
-    <w:tblGrid>
-      <w:gridCol w:w="9648"/>
-    </w:tblGrid>
-    <w:tr>
-      <w:tc>
-        <w:tcPr>
-          <w:tcW w:type="dxa" w:w="9648"/>
-        </w:tcPr>
-        <w:p>
-          <w:pPr>
-            <w:jc w:val="left"/>
-          </w:pPr>
-          <w:r>
-            <w:drawing>
-              <wp:inline xmlns:a="http://schemas.openxmlformats.org/drawingml/2006/main" xmlns:pic="http://schemas.openxmlformats.org/drawingml/2006/picture">
-                <wp:extent cx="3291840" cy="439498"/>
-                <wp:docPr id="1" name="Picture 1"/>
-                <wp:cNvGraphicFramePr>
-                  <a:graphicFrameLocks noChangeAspect="1"/>
-                </wp:cNvGraphicFramePr>
-                <a:graphic>
-                  <a:graphicData uri="http://schemas.openxmlformats.org/drawingml/2006/picture">
-                    <pic:pic>
-                      <pic:nvPicPr>
-                        <pic:cNvPr id="0" name="bt-beams-logo.png"/>
-                        <pic:cNvPicPr/>
-                      </pic:nvPicPr>
-                      <pic:blipFill>
-                        <a:blip r:embed="rId1"/>
-                        <a:stretch>
-                          <a:fillRect/>
-                        </a:stretch>
-                      </pic:blipFill>
-                      <pic:spPr>
-                        <a:xfrm>
-                          <a:off x="0" y="0"/>
-                          <a:ext cx="3291840" cy="439498"/>
-                        </a:xfrm>
-                        <a:prstGeom prst="rect"/>
-                      </pic:spPr>
-                    </pic:pic>
-                  </a:graphicData>
-                </a:graphic>
-              </wp:inline>
-            </w:drawing>
-          </w:r>
-        </w:p>
-      </w:tc>
-    </w:tr>
-  </w:tbl>
 </w:hdr>
 </file>
 
@@ -3572,12 +4118,12 @@
     <w:qFormat/>
     <w:rsid w:val="00FC693F"/>
     <w:pPr>
-      <w:spacing w:after="80" w:line="324" w:lineRule="auto"/>
+      <w:spacing w:after="120" w:line="276" w:lineRule="auto"/>
     </w:pPr>
     <w:rPr>
       <w:rFonts w:ascii="Calibri" w:hAnsi="Calibri"/>
-      <w:color w:val="425466"/>
-      <w:sz w:val="21"/>
+      <w:color w:val="333333"/>
+      <w:sz w:val="20"/>
     </w:rPr>
   </w:style>
   <w:style w:type="paragraph" w:styleId="Header">

</xml_diff>

<commit_message>
move dashboard out of /mockups/ — URL is now /dashboard/
Co-Authored-By: Claude Opus 4.7 (1M context) <noreply@anthropic.com>
</commit_message>
<xml_diff>
--- a/docs/PRD.docx
+++ b/docs/PRD.docx
@@ -4475,6 +4475,19 @@
         <w:t>1</w:t>
       </w:r>
     </w:fldSimple>
+    <w:r>
+      <w:rPr>
+        <w:rFonts w:ascii="Calibri" w:hAnsi="Calibri"/>
+        <w:color w:val="666666"/>
+        <w:sz w:val="16"/>
+      </w:rPr>
+      <w:t xml:space="preserve"> of </w:t>
+    </w:r>
+    <w:fldSimple w:instr="NUMPAGES">
+      <w:r>
+        <w:t>1</w:t>
+      </w:r>
+    </w:fldSimple>
   </w:p>
 </w:ftr>
 </file>

</xml_diff>

<commit_message>
docs(prd): regenerate PRD.docx as v2.1 (260517) — accreditations FRs
</commit_message>
<xml_diff>
--- a/docs/PRD.docx
+++ b/docs/PRD.docx
@@ -163,6 +163,21 @@
       </w:pPr>
       <w:r>
         <w:t>Views: Overview · Schools · School detail · Open Data · About · Settings</w:t>
+      </w:r>
+    </w:p>
+    <w:p>
+      <w:pPr>
+        <w:pStyle w:val="ListBullet"/>
+        <w:spacing w:after="40"/>
+      </w:pPr>
+      <w:r>
+        <w:rPr>
+          <w:b/>
+        </w:rPr>
+        <w:t>Accreditations surface</w:t>
+      </w:r>
+      <w:r>
+        <w:t>: green-school programme status (Punjab Green School / EPCCD, WWF-Pakistan, UNESCO GEP, Eco-Schools, PSSF) rendered on each school via verified-only chips on the Schools matrix and a full card with inline summaries in the school drawer. Verification pipeline (partner-attested) lands in v0.3; v0.1 ships with curated verified records only.</w:t>
       </w:r>
     </w:p>
     <w:p>
@@ -2138,6 +2153,258 @@
                 <w:sz w:val="18"/>
               </w:rPr>
               <w:t>Chat content not logged by default (metadata only: caller, latency, token counts)</w:t>
+            </w:r>
+          </w:p>
+        </w:tc>
+      </w:tr>
+    </w:tbl>
+    <w:p/>
+    <w:p>
+      <w:pPr>
+        <w:spacing w:before="240" w:after="120"/>
+      </w:pPr>
+      <w:r>
+        <w:rPr>
+          <w:rFonts w:ascii="Calibri" w:hAnsi="Calibri"/>
+          <w:b/>
+          <w:color w:val="333333"/>
+          <w:sz w:val="22"/>
+        </w:rPr>
+        <w:t>Accreditations</w:t>
+      </w:r>
+    </w:p>
+    <w:tbl>
+      <w:tblPr>
+        <w:tblW w:type="auto" w:w="0"/>
+        <w:jc w:val="center"/>
+        <w:tblLook w:firstColumn="1" w:firstRow="1" w:lastColumn="0" w:lastRow="0" w:noHBand="0" w:noVBand="1" w:val="04A0"/>
+        <w:tblBorders>
+          <w:top w:val="single" w:sz="4" w:space="0" w:color="999999"/>
+          <w:left w:val="single" w:sz="4" w:space="0" w:color="999999"/>
+          <w:bottom w:val="single" w:sz="4" w:space="0" w:color="999999"/>
+          <w:right w:val="single" w:sz="4" w:space="0" w:color="999999"/>
+          <w:insideH w:val="single" w:sz="4" w:space="0" w:color="999999"/>
+          <w:insideV w:val="single" w:sz="4" w:space="0" w:color="999999"/>
+        </w:tblBorders>
+      </w:tblPr>
+      <w:tblGrid>
+        <w:gridCol w:w="4680"/>
+        <w:gridCol w:w="4680"/>
+      </w:tblGrid>
+      <w:tr>
+        <w:tc>
+          <w:tcPr>
+            <w:tcW w:type="dxa" w:w="4680"/>
+            <w:shd w:fill="003D6B" w:val="clear"/>
+          </w:tcPr>
+          <w:p>
+            <w:pPr>
+              <w:jc w:val="left"/>
+            </w:pPr>
+            <w:r/>
+            <w:r>
+              <w:rPr>
+                <w:rFonts w:ascii="Calibri" w:hAnsi="Calibri"/>
+                <w:b/>
+                <w:color w:val="FFFFFF"/>
+                <w:sz w:val="18"/>
+              </w:rPr>
+              <w:t>#</w:t>
+            </w:r>
+          </w:p>
+        </w:tc>
+        <w:tc>
+          <w:tcPr>
+            <w:tcW w:type="dxa" w:w="4680"/>
+            <w:shd w:fill="003D6B" w:val="clear"/>
+          </w:tcPr>
+          <w:p>
+            <w:pPr>
+              <w:jc w:val="left"/>
+            </w:pPr>
+            <w:r/>
+            <w:r>
+              <w:rPr>
+                <w:rFonts w:ascii="Calibri" w:hAnsi="Calibri"/>
+                <w:b/>
+                <w:color w:val="FFFFFF"/>
+                <w:sz w:val="18"/>
+              </w:rPr>
+              <w:t>Requirement</w:t>
+            </w:r>
+          </w:p>
+        </w:tc>
+      </w:tr>
+      <w:tr>
+        <w:tc>
+          <w:tcPr>
+            <w:tcW w:type="dxa" w:w="4680"/>
+          </w:tcPr>
+          <w:p>
+            <w:r/>
+            <w:r>
+              <w:rPr>
+                <w:rFonts w:ascii="Calibri" w:hAnsi="Calibri"/>
+                <w:color w:val="333333"/>
+                <w:sz w:val="18"/>
+              </w:rPr>
+              <w:t>FR-N26</w:t>
+            </w:r>
+          </w:p>
+        </w:tc>
+        <w:tc>
+          <w:tcPr>
+            <w:tcW w:type="dxa" w:w="4680"/>
+          </w:tcPr>
+          <w:p>
+            <w:r/>
+            <w:r>
+              <w:rPr>
+                <w:rFonts w:ascii="Calibri" w:hAnsi="Calibri"/>
+                <w:color w:val="333333"/>
+                <w:sz w:val="18"/>
+              </w:rPr>
+              <w:t>Only records with `state = 'verified'` render on public surfaces (Schools matrix column, Overview rail, school drawer). Operator-declared records persist in the data layer but stay hidden until partner verification.</w:t>
+            </w:r>
+          </w:p>
+        </w:tc>
+      </w:tr>
+      <w:tr>
+        <w:tc>
+          <w:tcPr>
+            <w:tcW w:type="dxa" w:w="4680"/>
+            <w:shd w:fill="F2F2F2" w:val="clear"/>
+          </w:tcPr>
+          <w:p>
+            <w:r/>
+            <w:r>
+              <w:rPr>
+                <w:rFonts w:ascii="Calibri" w:hAnsi="Calibri"/>
+                <w:color w:val="333333"/>
+                <w:sz w:val="18"/>
+              </w:rPr>
+              <w:t>FR-N27</w:t>
+            </w:r>
+          </w:p>
+        </w:tc>
+        <w:tc>
+          <w:tcPr>
+            <w:tcW w:type="dxa" w:w="4680"/>
+            <w:shd w:fill="F2F2F2" w:val="clear"/>
+          </w:tcPr>
+          <w:p>
+            <w:r/>
+            <w:r>
+              <w:rPr>
+                <w:rFonts w:ascii="Calibri" w:hAnsi="Calibri"/>
+                <w:color w:val="333333"/>
+                <w:sz w:val="18"/>
+              </w:rPr>
+              <w:t>Verification is a partner-attested operation in v0.3 (EPCCD Punjab, WWF-Pakistan, UNESCO GEP). v0.2 ships a 2× admin "Mark verified" override with full audit-log entry + attached evidence URL.</w:t>
+            </w:r>
+          </w:p>
+        </w:tc>
+      </w:tr>
+      <w:tr>
+        <w:tc>
+          <w:tcPr>
+            <w:tcW w:type="dxa" w:w="4680"/>
+          </w:tcPr>
+          <w:p>
+            <w:r/>
+            <w:r>
+              <w:rPr>
+                <w:rFonts w:ascii="Calibri" w:hAnsi="Calibri"/>
+                <w:color w:val="333333"/>
+                <w:sz w:val="18"/>
+              </w:rPr>
+              <w:t>FR-N28</w:t>
+            </w:r>
+          </w:p>
+        </w:tc>
+        <w:tc>
+          <w:tcPr>
+            <w:tcW w:type="dxa" w:w="4680"/>
+          </w:tcPr>
+          <w:p>
+            <w:r/>
+            <w:r>
+              <w:rPr>
+                <w:rFonts w:ascii="Calibri" w:hAnsi="Calibri"/>
+                <w:color w:val="333333"/>
+                <w:sz w:val="18"/>
+              </w:rPr>
+              <w:t>Drawer renders the full label, source authority, year, and inline summary per accreditation. Compact chips on the Schools matrix surface `&lt;TYPE&gt; · &lt;YEAR&gt;` with a hover tooltip carrying the same body. Tooltips are suppressed inside the school drawer (overflow-clipped); the inline card carries the body instead.</w:t>
+            </w:r>
+          </w:p>
+        </w:tc>
+      </w:tr>
+      <w:tr>
+        <w:tc>
+          <w:tcPr>
+            <w:tcW w:type="dxa" w:w="4680"/>
+            <w:shd w:fill="F2F2F2" w:val="clear"/>
+          </w:tcPr>
+          <w:p>
+            <w:r/>
+            <w:r>
+              <w:rPr>
+                <w:rFonts w:ascii="Calibri" w:hAnsi="Calibri"/>
+                <w:color w:val="333333"/>
+                <w:sz w:val="18"/>
+              </w:rPr>
+              <w:t>FR-N29</w:t>
+            </w:r>
+          </w:p>
+        </w:tc>
+        <w:tc>
+          <w:tcPr>
+            <w:tcW w:type="dxa" w:w="4680"/>
+            <w:shd w:fill="F2F2F2" w:val="clear"/>
+          </w:tcPr>
+          <w:p>
+            <w:r/>
+            <w:r>
+              <w:rPr>
+                <w:rFonts w:ascii="Calibri" w:hAnsi="Calibri"/>
+                <w:color w:val="333333"/>
+                <w:sz w:val="18"/>
+              </w:rPr>
+              <w:t>Accreditation badge palette is colour-coded per authority and consistent across surfaces (Schools matrix, Overview rail, drawer, About explainer card).</w:t>
+            </w:r>
+          </w:p>
+        </w:tc>
+      </w:tr>
+      <w:tr>
+        <w:tc>
+          <w:tcPr>
+            <w:tcW w:type="dxa" w:w="4680"/>
+          </w:tcPr>
+          <w:p>
+            <w:r/>
+            <w:r>
+              <w:rPr>
+                <w:rFonts w:ascii="Calibri" w:hAnsi="Calibri"/>
+                <w:color w:val="333333"/>
+                <w:sz w:val="18"/>
+              </w:rPr>
+              <w:t>FR-N30</w:t>
+            </w:r>
+          </w:p>
+        </w:tc>
+        <w:tc>
+          <w:tcPr>
+            <w:tcW w:type="dxa" w:w="4680"/>
+          </w:tcPr>
+          <w:p>
+            <w:r/>
+            <w:r>
+              <w:rPr>
+                <w:rFonts w:ascii="Calibri" w:hAnsi="Calibri"/>
+                <w:color w:val="333333"/>
+                <w:sz w:val="18"/>
+              </w:rPr>
+              <w:t>Accreditations are exposed in the Open Data Layer as `accreditations.csv` (verified-only); operator-declared records do **not** export until verified.</w:t>
             </w:r>
           </w:p>
         </w:tc>

</xml_diff>